<commit_message>
docs: correct Appendix B stale table names in User_Manual
Appendix B's schema summary used pre-rename table names
(restaurants/menu_items) instead of current (stores/products) —
fixed in document.xml directly, docx rezipped, PDF regenerated.
Also records the n8n container APP_BASE_URL port fix (3001->3000)
in project memory.

Co-Authored-By: Claude Sonnet 5 <noreply@anthropic.com>
</commit_message>
<xml_diff>
--- a/docs/User_Manual.docx
+++ b/docs/User_Manual.docx
@@ -3222,7 +3222,7 @@
           <w:iCs/>
           <w:color w:val="6B4A15"/>
         </w:rPr>
-        <w:t xml:space="preserve">Any code path that touches an item's price is written using integer-paisa arithmetic; Postgres's own numeric constraints on the menu_items and orders tables reject invalid values, giving the platform a second line of defence even if a client-side validation were ever bypassed.</w:t>
+        <w:t xml:space="preserve">Any code path that touches an item's price is written using integer-paisa arithmetic; Postgres's own numeric constraints on the products and orders tables reject invalid values, giving the platform a second line of defence even if a client-side validation were ever bypassed.</w:t>
       </w:r>
     </w:p>
     <w:p>
@@ -5185,7 +5185,7 @@
           <w:bCs/>
           <w:color w:val="E8871E"/>
         </w:rPr>
-        <w:t xml:space="preserve">B.3 restaurants</w:t>
+        <w:t xml:space="preserve">B.3 stores</w:t>
       </w:r>
     </w:p>
     <w:p>
@@ -5210,7 +5210,7 @@
           <w:bCs/>
           <w:color w:val="E8871E"/>
         </w:rPr>
-        <w:t xml:space="preserve">B.4 menu_items</w:t>
+        <w:t xml:space="preserve">B.4 products</w:t>
       </w:r>
     </w:p>
     <w:p>
@@ -5619,7 +5619,7 @@
                 <w:sz w:val="20"/>
                 <w:szCs w:val="20"/>
               </w:rPr>
-              <w:t xml:space="preserve">restaurants</w:t>
+              <w:t xml:space="preserve">stores</w:t>
             </w:r>
           </w:p>
         </w:tc>
@@ -5690,7 +5690,7 @@
                 <w:sz w:val="20"/>
                 <w:szCs w:val="20"/>
               </w:rPr>
-              <w:t xml:space="preserve">menu_items</w:t>
+              <w:t xml:space="preserve">products</w:t>
             </w:r>
           </w:p>
         </w:tc>

</xml_diff>

<commit_message>
docs: update both user manuals for mobile redesign and live n8n verification
Mobile_App_User_Manual regenerated (9->15 pages) to reflect the
UberEats-style redesign (tab nav, bottom-sheet cart/customization,
collapsible checkout, status-stepper tracking), with 7 labeled
wireframe diagrams (no fabricated screenshots, per standing decision).

User_Manual grew to 37 pages after adding a dated, live-verified n8n
section: placed a real order through the running app, confirmed
workflows 01/02 fire correctly, found workflow 04 (auto-assignment)
does not fire in this environment (self-claim remains the working
path) - documented honestly rather than assumed working. Existing
architecture/process-flow diagrams and per-role chapters were
verified accurate against current source, not rebuilt unnecessarily.

MEMORY.md records the workflow 04 gap as a real finding worth a
follow-up, not a documentation artifact.

Co-Authored-By: Claude Sonnet 5 <noreply@anthropic.com>
</commit_message>
<xml_diff>
--- a/docs/User_Manual.docx
+++ b/docs/User_Manual.docx
@@ -329,7 +329,7 @@
         </w:rPr>
         <w:t>Appendix A — Technical Architecture &amp; Stack</w:t>
         <w:tab/>
-        <w:t>27</w:t>
+        <w:t>29</w:t>
       </w:r>
       <w:r/>
       <w:r>
@@ -353,7 +353,7 @@
         </w:rPr>
         <w:t>Appendix B — Database Schema Reference</w:t>
         <w:tab/>
-        <w:t>29</w:t>
+        <w:t>31</w:t>
       </w:r>
       <w:r/>
       <w:r>
@@ -377,7 +377,7 @@
         </w:rPr>
         <w:t>Appendix C — Seeded Test Accounts</w:t>
         <w:tab/>
-        <w:t>31</w:t>
+        <w:t>33</w:t>
       </w:r>
       <w:r/>
       <w:r>
@@ -401,7 +401,7 @@
         </w:rPr>
         <w:t>Appendix D — Glossary of Terms</w:t>
         <w:tab/>
-        <w:t>35</w:t>
+        <w:t>37</w:t>
       </w:r>
       <w:r/>
       <w:r>
@@ -4456,6 +4456,332 @@
           <w:color w:val="1A1A1A"/>
         </w:rPr>
         <w:t xml:space="preserve">A set of n8n workflows automate cross-portal side effects that would otherwise require polling: resolving a mock payment shortly after an order is placed, notifying a vendor of a new order, and similar events. n8n calls back into the Next.js application through a small family of "/api/internal/*" routes, authenticated with a shared secret header (X-Internal-Secret) rather than a normal user session, since these calls originate from an automation server rather than a logged-in browser. If no n8n instance is reachable, every one of these flows still completes correctly through an in-process fallback inside the relevant API route — n8n makes the demo faster, not functionally required.</w:t>
+      </w:r>
+    </w:p>
+    <w:p>
+      <w:pPr>
+        <w:pStyle w:val="Heading3"/>
+        <w:spacing w:before="200" w:after="100"/>
+      </w:pPr>
+      <w:r>
+        <w:rPr>
+          <w:b/>
+          <w:bCs/>
+          <w:color w:val="3A4A6B"/>
+        </w:rPr>
+        <w:t xml:space="preserve">7.2.1 The 5 Workflows and What Triggers Each</w:t>
+      </w:r>
+    </w:p>
+    <w:p>
+      <w:pPr>
+        <w:spacing w:after="160"/>
+      </w:pPr>
+      <w:r>
+        <w:rPr>
+          <w:color w:val="1A1A1A"/>
+        </w:rPr>
+        <w:t xml:space="preserve">All 5 workflows are triggered by a Postgres Database Webhook (via the n8n_notify() trigger function on the orders/payments tables) firing an HTTP POST to n8n on a row INSERT or UPDATE OF status — none of the 5 is interval- or cron-based. Supabase fires the webhook on every row event for the table it is attached to; each workflow's own IF/Filter node is what narrows execution down to the specific status value(s) it cares about.</w:t>
+      </w:r>
+    </w:p>
+    <w:p>
+      <w:pPr>
+        <w:spacing w:after="40"/>
+      </w:pPr>
+      <w:r>
+        <w:rPr>
+          <w:b/>
+          <w:bCs/>
+          <w:color w:val="3A4A6B"/>
+        </w:rPr>
+        <w:t xml:space="preserve">01 — Order Placed</w:t>
+      </w:r>
+    </w:p>
+    <w:p>
+      <w:pPr>
+        <w:spacing w:after="40"/>
+      </w:pPr>
+      <w:r>
+        <w:rPr>
+          <w:i/>
+          <w:iCs/>
+          <w:color w:val="555555"/>
+        </w:rPr>
+        <w:t xml:space="preserve">Trigger: orders INSERT</w:t>
+      </w:r>
+    </w:p>
+    <w:p>
+      <w:pPr>
+        <w:spacing w:after="140"/>
+      </w:pPr>
+      <w:r>
+        <w:rPr>
+          <w:color w:val="1A1A1A"/>
+        </w:rPr>
+        <w:t xml:space="preserve">Calls POST /api/internal/orders/[id]/notify-vendor, which writes a row to public.notifications for the vendor.</w:t>
+      </w:r>
+    </w:p>
+    <w:p>
+      <w:pPr>
+        <w:spacing w:after="40"/>
+      </w:pPr>
+      <w:r>
+        <w:rPr>
+          <w:b/>
+          <w:bCs/>
+          <w:color w:val="3A4A6B"/>
+        </w:rPr>
+        <w:t xml:space="preserve">02 — Payment Mock Confirmation</w:t>
+      </w:r>
+    </w:p>
+    <w:p>
+      <w:pPr>
+        <w:spacing w:after="40"/>
+      </w:pPr>
+      <w:r>
+        <w:rPr>
+          <w:i/>
+          <w:iCs/>
+          <w:color w:val="555555"/>
+        </w:rPr>
+        <w:t xml:space="preserve">Trigger: payments INSERT (status='pending')</w:t>
+      </w:r>
+    </w:p>
+    <w:p>
+      <w:pPr>
+        <w:spacing w:after="140"/>
+      </w:pPr>
+      <w:r>
+        <w:rPr>
+          <w:color w:val="1A1A1A"/>
+        </w:rPr>
+        <w:t xml:space="preserve">Calls back into the app to resolve the mock payment to success/failed via applyPaymentResult(). The checkout route itself polls for up to ~10s and falls back to resolving the payment in-process if n8n does not answer in time, so checkout behaves identically either way.</w:t>
+      </w:r>
+    </w:p>
+    <w:p>
+      <w:pPr>
+        <w:spacing w:after="40"/>
+      </w:pPr>
+      <w:r>
+        <w:rPr>
+          <w:b/>
+          <w:bCs/>
+          <w:color w:val="3A4A6B"/>
+        </w:rPr>
+        <w:t xml:space="preserve">03 — Restaurant Accepts / Status Change</w:t>
+      </w:r>
+    </w:p>
+    <w:p>
+      <w:pPr>
+        <w:spacing w:after="40"/>
+      </w:pPr>
+      <w:r>
+        <w:rPr>
+          <w:i/>
+          <w:iCs/>
+          <w:color w:val="555555"/>
+        </w:rPr>
+        <w:t xml:space="preserve">Trigger: orders UPDATE OF status (accepted/preparing/ready)</w:t>
+      </w:r>
+    </w:p>
+    <w:p>
+      <w:pPr>
+        <w:spacing w:after="140"/>
+      </w:pPr>
+      <w:r>
+        <w:rPr>
+          <w:color w:val="1A1A1A"/>
+        </w:rPr>
+        <w:t xml:space="preserve">Writes a placeholder notification row on every filtered transition; on accepted specifically, a second branch also emails the customer via a Gmail node (requires a connected Gmail OAuth2 credential — without one this branch fails at the Gmail node only, which does not block the order).</w:t>
+      </w:r>
+    </w:p>
+    <w:p>
+      <w:pPr>
+        <w:spacing w:after="40"/>
+      </w:pPr>
+      <w:r>
+        <w:rPr>
+          <w:b/>
+          <w:bCs/>
+          <w:color w:val="3A4A6B"/>
+        </w:rPr>
+        <w:t xml:space="preserve">04 — Delivery Partner Assignment</w:t>
+      </w:r>
+    </w:p>
+    <w:p>
+      <w:pPr>
+        <w:spacing w:after="40"/>
+      </w:pPr>
+      <w:r>
+        <w:rPr>
+          <w:i/>
+          <w:iCs/>
+          <w:color w:val="555555"/>
+        </w:rPr>
+        <w:t xml:space="preserve">Trigger: orders UPDATE OF status = ready</w:t>
+      </w:r>
+    </w:p>
+    <w:p>
+      <w:pPr>
+        <w:spacing w:after="140"/>
+      </w:pPr>
+      <w:r>
+        <w:rPr>
+          <w:color w:val="1A1A1A"/>
+        </w:rPr>
+        <w:t xml:space="preserve">Looks up the store's lat/lng, requests nearest-first candidate delivery partners, and assigns the closest online partner automatically if any are online.</w:t>
+      </w:r>
+    </w:p>
+    <w:p>
+      <w:pPr>
+        <w:spacing w:after="40"/>
+      </w:pPr>
+      <w:r>
+        <w:rPr>
+          <w:b/>
+          <w:bCs/>
+          <w:color w:val="3A4A6B"/>
+        </w:rPr>
+        <w:t xml:space="preserve">05 — Delivery Status Propagation</w:t>
+      </w:r>
+    </w:p>
+    <w:p>
+      <w:pPr>
+        <w:spacing w:after="40"/>
+      </w:pPr>
+      <w:r>
+        <w:rPr>
+          <w:i/>
+          <w:iCs/>
+          <w:color w:val="555555"/>
+        </w:rPr>
+        <w:t xml:space="preserve">Trigger: orders UPDATE OF status (picked_up/delivered)</w:t>
+      </w:r>
+    </w:p>
+    <w:p>
+      <w:pPr>
+        <w:spacing w:after="140"/>
+      </w:pPr>
+      <w:r>
+        <w:rPr>
+          <w:color w:val="1A1A1A"/>
+        </w:rPr>
+        <w:t xml:space="preserve">Propagates delivery-side status changes to any downstream notification/logging the workflow defines.</w:t>
+      </w:r>
+    </w:p>
+    <w:p>
+      <w:pPr>
+        <w:pStyle w:val="Heading3"/>
+        <w:spacing w:before="200" w:after="100"/>
+      </w:pPr>
+      <w:r>
+        <w:rPr>
+          <w:b/>
+          <w:bCs/>
+          <w:color w:val="3A4A6B"/>
+        </w:rPr>
+        <w:t xml:space="preserve">7.2.2 Live Verification — 2026-09-28</w:t>
+      </w:r>
+    </w:p>
+    <w:p>
+      <w:pPr>
+        <w:spacing w:after="140"/>
+      </w:pPr>
+      <w:r>
+        <w:rPr>
+          <w:color w:val="1A1A1A"/>
+        </w:rPr>
+        <w:t xml:space="preserve">The local stack (self-hosted Supabase via Docker, the n8n container with N8N_INTERNAL_SECRET/APP_BASE_URL/SUPABASE_URL all set to host.docker.internal per docs/n8n-webhook-setup.md, and the Next.js dev server) was started fresh and a real order was placed end-to-end through the running customer app (test account customer@foodhub.local) to observe actual behaviour, not just configuration. Findings, checked directly against Postgres rather than assumed from n8n's execution log:</w:t>
+      </w:r>
+    </w:p>
+    <w:p>
+      <w:pPr>
+        <w:pStyle w:val="ListParagraph"/>
+        <w:numPr>
+          <w:ilvl w:val="0"/>
+          <w:numId w:val="1"/>
+        </w:numPr>
+        <w:spacing w:after="100"/>
+      </w:pPr>
+      <w:r>
+        <w:rPr>
+          <w:color w:val="1A1A1A"/>
+        </w:rPr>
+        <w:t xml:space="preserve">Workflow 01 (Order Placed): confirmed firing. The order was placed at 00:13:42 UTC and a matching row appeared in public.notifications at 00:13:44.98 — about 2.6 seconds later, consistent with a live webhook round trip rather than the app's own code creating that row synchronously.</w:t>
+      </w:r>
+    </w:p>
+    <w:p>
+      <w:pPr>
+        <w:pStyle w:val="ListParagraph"/>
+        <w:numPr>
+          <w:ilvl w:val="0"/>
+          <w:numId w:val="1"/>
+        </w:numPr>
+        <w:spacing w:after="100"/>
+      </w:pPr>
+      <w:r>
+        <w:rPr>
+          <w:color w:val="1A1A1A"/>
+        </w:rPr>
+        <w:t xml:space="preserve">Workflow 02 (Payment Mock Confirmation): confirmed firing. The order's payment moved from pending to success at 00:13:46.78 — about 4.4 seconds after checkout, well inside the ~10-second in-process fallback window documented in section 7.2 and Appendix A, so this resolution was n8n's, not the fallback's.</w:t>
+      </w:r>
+    </w:p>
+    <w:p>
+      <w:pPr>
+        <w:pStyle w:val="ListParagraph"/>
+        <w:numPr>
+          <w:ilvl w:val="0"/>
+          <w:numId w:val="1"/>
+        </w:numPr>
+        <w:spacing w:after="100"/>
+      </w:pPr>
+      <w:r>
+        <w:rPr>
+          <w:color w:val="1A1A1A"/>
+        </w:rPr>
+        <w:t xml:space="preserve">Workflow 03 (Restaurant Accepts): the seeded vendor account (daily-basket@foodhub.local) advanced the same order through accepted → preparing → ready via /vendor/orders in this session, which is the real trigger for workflow 03's filtered UPDATE OF status. The Gmail-send branch was not separately confirmed (no Gmail credential is configured in this local n8n instance, matching the known gap in section 4 of docs/n8n-webhook-setup.md), so this document does not claim that branch fired — only that the accepted/preparing/ready transitions themselves, which are what the workflow listens for, occurred live.</w:t>
+      </w:r>
+    </w:p>
+    <w:p>
+      <w:pPr>
+        <w:pStyle w:val="ListParagraph"/>
+        <w:numPr>
+          <w:ilvl w:val="0"/>
+          <w:numId w:val="1"/>
+        </w:numPr>
+        <w:spacing w:after="100"/>
+      </w:pPr>
+      <w:r>
+        <w:rPr>
+          <w:color w:val="1A1A1A"/>
+        </w:rPr>
+        <w:t xml:space="preserve">Workflow 04 (Delivery Partner Assignment): NOT observed to auto-assign in this test. With the order at status=ready and a delivery partner already online (delivery@foodhub.local), the order appeared under that partner's “Available orders” list for manual self-claim rather than being auto-assigned by the workflow — orders.delivery_partner_id remained null until the partner claimed it by hand through /delivery/dashboard. This manual is deliberately not claiming workflow 04 fired successfully; it may not be active in this local n8n instance, or its assignment call may not have succeeded silently. Either way, the self-claim path (section 5.2) worked correctly as the primary, always-available assignment mechanism, exactly as designed — workflow 04 is additive automation on top of it, not a replacement for it.</w:t>
+      </w:r>
+    </w:p>
+    <w:p>
+      <w:pPr>
+        <w:pStyle w:val="ListParagraph"/>
+        <w:numPr>
+          <w:ilvl w:val="0"/>
+          <w:numId w:val="1"/>
+        </w:numPr>
+        <w:spacing w:after="100"/>
+      </w:pPr>
+      <w:r>
+        <w:rPr>
+          <w:color w:val="1A1A1A"/>
+        </w:rPr>
+        <w:t xml:space="preserve">Workflow 05 (Delivery Status Propagation): not separately exercised in this pass (the test order was left at the claimed/assigned stage); see docs/n8n-webhook-setup.md section 5 for its documented test procedure.</w:t>
+      </w:r>
+    </w:p>
+    <w:p>
+      <w:pPr>
+        <w:spacing w:after="160"/>
+      </w:pPr>
+      <w:r>
+        <w:rPr>
+          <w:color w:val="1A1A1A"/>
+        </w:rPr>
+        <w:t xml:space="preserve">Net conclusion: this local instance's checkout-critical automation (workflows 01 and 02) is live, active, and measurably faster than its own documented fallback — not merely configured on paper. Workflow 04's auto-assignment did not visibly act in this run, so treat delivery self-claim as the mechanism to rely on and workflow 04 as an unconfirmed bonus in this environment rather than a guaranteed path.</w:t>
       </w:r>
     </w:p>
     <w:p>

</xml_diff>

<commit_message>
docs: refresh web user manual (v3.0) for order visibility, delivery and admin changes
New screenshots from a production build (fake data only), new figures for
the Orders list, 6-step tracker, vendor full-details dialog, delivery
Active/Available/History and admin sidebar screens, text updated for the
phone field, delivered email and admin add-vendor/partner forms, diagrams
regenerated (Accept instead of Claim), TOC renumbered (44 pages).

Co-Authored-By: Claude Sonnet 5.5 <noreply@anthropic.com>
</commit_message>
<xml_diff>
--- a/docs/User_Manual.docx
+++ b/docs/User_Manual.docx
@@ -100,7 +100,7 @@
           <w:sz w:val="22"/>
           <w:szCs w:val="22"/>
         </w:rPr>
-        <w:t>Version 2.0 — updated for the Figma-kit redesign</w:t>
+        <w:t xml:space="preserve">Version 3.0 — order visibility, delivery and admin management</w:t>
       </w:r>
     </w:p>
     <w:p>
@@ -115,7 +115,7 @@
           <w:sz w:val="22"/>
           <w:szCs w:val="22"/>
         </w:rPr>
-        <w:t xml:space="preserve">September 2026</w:t>
+        <w:t xml:space="preserve">1 October 2026</w:t>
       </w:r>
     </w:p>
     <w:p>
@@ -189,7 +189,7 @@
         <w:rPr>
           <w:color w:val="1B2A4A"/>
         </w:rPr>
-        <w:t>5</w:t>
+        <w:t>6</w:t>
       </w:r>
     </w:p>
     <w:p>
@@ -239,7 +239,7 @@
         <w:rPr>
           <w:color w:val="1B2A4A"/>
         </w:rPr>
-        <w:t>16</w:t>
+        <w:t>19</w:t>
       </w:r>
     </w:p>
     <w:p>
@@ -257,7 +257,7 @@
         </w:rPr>
         <w:t>Chapter 5 — Delivery Partner Module</w:t>
         <w:tab/>
-        <w:t>22</w:t>
+        <w:t>25</w:t>
       </w:r>
     </w:p>
     <w:p>
@@ -275,7 +275,7 @@
         </w:rPr>
         <w:t>Chapter 6 — Admin Module</w:t>
         <w:tab/>
-        <w:t>24</w:t>
+        <w:t>28</w:t>
       </w:r>
     </w:p>
     <w:p>
@@ -293,7 +293,7 @@
         </w:rPr>
         <w:t>Chapter 7 — Cross-Cutting Features</w:t>
         <w:tab/>
-        <w:t>28</w:t>
+        <w:t>33</w:t>
       </w:r>
     </w:p>
     <w:p>
@@ -311,7 +311,7 @@
         </w:rPr>
         <w:t>Appendix A — Technical Architecture &amp; Stack</w:t>
         <w:tab/>
-        <w:t>31</w:t>
+        <w:t>36</w:t>
       </w:r>
     </w:p>
     <w:p>
@@ -329,7 +329,7 @@
         </w:rPr>
         <w:t>Appendix B — Database Schema Reference</w:t>
         <w:tab/>
-        <w:t>33</w:t>
+        <w:t>38</w:t>
       </w:r>
     </w:p>
     <w:p>
@@ -347,7 +347,7 @@
         </w:rPr>
         <w:t>Appendix C — Seeded Test Accounts</w:t>
         <w:tab/>
-        <w:t>35</w:t>
+        <w:t>40</w:t>
       </w:r>
     </w:p>
     <w:p>
@@ -365,7 +365,7 @@
         </w:rPr>
         <w:t>Appendix D — Glossary of Terms</w:t>
         <w:tab/>
-        <w:t>39</w:t>
+        <w:t>44</w:t>
       </w:r>
     </w:p>
     <w:p>
@@ -436,7 +436,7 @@
         <w:rPr>
           <w:color w:val="1A1A1A"/>
         </w:rPr>
-        <w:t xml:space="preserve">Customer App ("/customer") — anonymous browsing of every store and category, cart management, checkout with contact details and a choice of payment method, and order tracking.</w:t>
+        <w:t xml:space="preserve">Customer App ("/customer") — anonymous browsing of every store and category, cart management, checkout with contact details (including a required phone number) and a choice of payment method, and an Orders list with a full order detail page and six-step tracker.</w:t>
       </w:r>
     </w:p>
     <w:p>
@@ -452,7 +452,7 @@
         <w:rPr>
           <w:color w:val="1A1A1A"/>
         </w:rPr>
-        <w:t xml:space="preserve">Vendor Portal ("/vendor") — store owners (restaurants and every other marketplace category) manage their menu/catalog, open or close their store, set delivery fee and promo text, and work incoming orders through a kanban board.</w:t>
+        <w:t xml:space="preserve">Vendor Portal ("/vendor") — store owners (restaurants and every other marketplace category) manage their menu/catalog, open or close their store, set delivery fee and promo text, and work incoming orders through a colour-coded kanban board that shows who each order is for, with a Full details view.</w:t>
       </w:r>
     </w:p>
     <w:p>
@@ -468,7 +468,7 @@
         <w:rPr>
           <w:color w:val="1A1A1A"/>
         </w:rPr>
-        <w:t xml:space="preserve">Delivery Partner Portal ("/delivery") — delivery partners go online, claim ready orders, and advance them from picked-up to delivered while sharing a live location ping.</w:t>
+        <w:t xml:space="preserve">Delivery Partner Portal ("/delivery") — delivery partners go online, accept ready orders, and advance them from picked-up to delivered using full pickup and drop-off details on each card, with a History of finished deliveries and a live location ping.</w:t>
       </w:r>
     </w:p>
     <w:p>
@@ -484,7 +484,7 @@
         <w:rPr>
           <w:color w:val="1A1A1A"/>
         </w:rPr>
-        <w:t xml:space="preserve">Admin Portal ("/admin") — platform staff see every order, restaurant and delivery partner, suspend a misbehaving store, and reassign a stuck delivery to a different partner.</w:t>
+        <w:t xml:space="preserve">Admin Portal ("/admin") — platform staff see every order and open its full detail, add vendors and delivery partners, suspend a misbehaving store, and reassign a stuck delivery to a different partner.</w:t>
       </w:r>
     </w:p>
     <w:p>
@@ -531,7 +531,7 @@
         <w:rPr>
           <w:color w:val="1A1A1A"/>
         </w:rPr>
-        <w:t xml:space="preserve">A separate automation layer, n8n, listens for events such as an order being placed and drives cross-portal side effects — resolving a mock payment, notifying the vendor, and so on — by calling a small set of internal API routes ("/api/internal/*") protected by a shared secret header. If n8n is not running, the same checkout still works: the checkout route falls back to resolving payment itself after a short wait, so the demo experience never depends on n8n being present.</w:t>
+        <w:t xml:space="preserve">A separate automation layer, n8n, listens for events such as an order being placed and drives cross-portal side effects — resolving a mock payment, notifying the vendor, emailing the customer when an order is accepted and when it is delivered, and so on — by calling a small set of internal API routes ("/api/internal/*") protected by a shared secret header. If n8n is not running, the same checkout still works: the checkout route falls back to resolving payment itself after a short wait, so the demo experience never depends on n8n being present.</w:t>
       </w:r>
     </w:p>
     <w:p>
@@ -558,7 +558,7 @@
                     </pic:cNvPicPr>
                   </pic:nvPicPr>
                   <pic:blipFill>
-                    <a:blip r:embed="rId8" cstate="none"/>
+                    <a:blip r:embed="rId29" cstate="none"/>
                     <a:srcRect/>
                     <a:stretch>
                       <a:fillRect/>
@@ -632,7 +632,7 @@
           <w:bCs/>
           <w:color w:val="E8871E"/>
         </w:rPr>
-        <w:t>1.4 What's New in Version 2.0</w:t>
+        <w:t xml:space="preserve">1.4 What's New in Version 3.0</w:t>
       </w:r>
     </w:p>
     <w:p>
@@ -643,7 +643,7 @@
         <w:rPr>
           <w:color w:val="1A1A1A"/>
         </w:rPr>
-        <w:t>This edition replaces every screenshot with captures of the current build and adds the changes made since version 1.0:</w:t>
+        <w:t xml:space="preserve">This edition refreshes the screenshots of every screen that changed and adds the following since version 2.0:</w:t>
       </w:r>
     </w:p>
     <w:p>
@@ -659,7 +659,7 @@
         <w:rPr>
           <w:color w:val="1A1A1A"/>
         </w:rPr>
-        <w:t>New look: an orange / navy / green palette with pill-shaped buttons, rounded cards and colored section backgrounds on all four portals. Colors used behind white text were darkened so buttons, badges and dashboard tiles are easy to read.</w:t>
+        <w:t xml:space="preserve">Phone number at checkout: Checkout now has a required Phone field under Contact details (an Indian 10-digit mobile number starting with 6 to 9; an optional +91, 91 or 0 prefix is accepted). It is stored as +91XXXXXXXXXX and shown to the vendor and, once an order is assigned, to the delivery partner.</w:t>
       </w:r>
     </w:p>
     <w:p>
@@ -675,7 +675,7 @@
         <w:rPr>
           <w:color w:val="1A1A1A"/>
         </w:rPr>
-        <w:t>Always signed out after a restart: when the application server is restarted, every browser starts signed out and you must sign in again. Normal page navigation and reloads keep you signed in while the server keeps running.</w:t>
+        <w:t xml:space="preserve">Orders list and order detail: the sidebar Orders link opens your list of orders (store, date, status, item thumbnails and total). Opening an order shows a six-step tracker (Placed, Accepted, Preparing, Ready, On the way, Delivered), the deliver-to details, the items with photos, totals, payment and a timeline. The status wording is now Partner assigned and On the way instead of a single Out for delivery.</w:t>
       </w:r>
     </w:p>
     <w:p>
@@ -691,7 +691,7 @@
         <w:rPr>
           <w:color w:val="1A1A1A"/>
         </w:rPr>
-        <w:t>My Profile: every portal now shows your name with a Reset password link — in the account menu for customers and in the left sidebar for vendors, delivery partners and admins.</w:t>
+        <w:t xml:space="preserve">Delivered email: when an order is delivered, a confirmation email goes to the email address entered at checkout (subject "Your order from &lt;store&gt; has been delivered") listing the items, totals and where it was delivered. The order-accepted email goes to the same address.</w:t>
       </w:r>
     </w:p>
     <w:p>
@@ -707,7 +707,7 @@
         <w:rPr>
           <w:color w:val="1A1A1A"/>
         </w:rPr>
-        <w:t>Your chosen delivery location is remembered between visits; checkout name, email and address always start blank.</w:t>
+        <w:t xml:space="preserve">Vendor Orders board: larger type and colour-coded New, Accepted, Preparing and Ready columns; every card shows who the order is for, phone, payment, address, items with photos and any delivery note, and Full details opens the complete order. The board refreshes every 10 seconds.</w:t>
       </w:r>
     </w:p>
     <w:p>
@@ -723,7 +723,39 @@
         <w:rPr>
           <w:color w:val="1A1A1A"/>
         </w:rPr>
-        <w:t>Delivery partner and admin portals now use the same left-sidebar layout as the vendor portal.</w:t>
+        <w:t xml:space="preserve">Delivery partner Dashboard and History: the Dashboard now shows active work only, with the pickup store and address, the recipient name, tap-to-call phone and address, and the items on each card; available orders show the customer only after you press Accept (the old View address button and the Claim wording are gone). A new History page lists finished deliveries.</w:t>
+      </w:r>
+    </w:p>
+    <w:p>
+      <w:pPr>
+        <w:pStyle w:val="ListParagraph"/>
+        <w:numPr>
+          <w:ilvl w:val="0"/>
+          <w:numId w:val="1"/>
+        </w:numPr>
+        <w:spacing w:after="80"/>
+      </w:pPr>
+      <w:r>
+        <w:rPr>
+          <w:color w:val="1A1A1A"/>
+        </w:rPr>
+        <w:t xml:space="preserve">Admin portal: the old tabbed page is replaced by a sidebar with Overview (summary tiles), Orders (table with a status filter), an order detail page with a Reassign control, Vendors (with Add vendor) and Delivery Partners (with Add delivery partner). The admin types a temporary password (minimum 6 characters) and shares it with the new account holder.</w:t>
+      </w:r>
+    </w:p>
+    <w:p>
+      <w:pPr>
+        <w:pStyle w:val="ListParagraph"/>
+        <w:numPr>
+          <w:ilvl w:val="0"/>
+          <w:numId w:val="1"/>
+        </w:numPr>
+        <w:spacing w:after="80"/>
+      </w:pPr>
+      <w:r>
+        <w:rPr>
+          <w:color w:val="1A1A1A"/>
+        </w:rPr>
+        <w:t xml:space="preserve">Carried over from version 2.0: the orange / navy / green look with pill-shaped buttons; every browser starts signed out after the server restarts; My Profile with a Reset password link in every portal; your delivery location is remembered between visits; and the delivery and admin portals use the same left-sidebar layout as the vendor portal.</w:t>
       </w:r>
     </w:p>
     <w:p>
@@ -1428,13 +1460,9 @@
       </w:r>
     </w:p>
     <w:p>
-      <w:r>
-        <w:br w:type="page"/>
-      </w:r>
-    </w:p>
-    <w:p>
       <w:pPr>
         <w:pStyle w:val="Heading2"/>
+        <w:pageBreakBefore/>
       </w:pPr>
       <w:r>
         <w:t>2.5 Testing Multiple Roles at Once (Multi-Port Mode)</w:t>
@@ -2320,7 +2348,7 @@
         <w:rPr>
           <w:color w:val="1A1A1A"/>
         </w:rPr>
-        <w:t xml:space="preserve">Contact details — a recipient name and email, pre-filled from your account profile where available, used for order-update notifications.</w:t>
+        <w:t xml:space="preserve">Contact details — a recipient name, email and a required Phone (an Indian 10-digit mobile number starting with 6 to 9; a +91, 91 or 0 prefix is optional and is stored as +91XXXXXXXXXX). The email receives the order-accepted and order-delivered emails; the phone is shown to the vendor and, once a delivery partner is assigned, to that partner.</w:t>
       </w:r>
     </w:p>
     <w:p>
@@ -2363,7 +2391,7 @@
         <w:rPr>
           <w:color w:val="1A1A1A"/>
         </w:rPr>
-        <w:t xml:space="preserve">The Place Order button stays disabled (greyed out) until every required field for the selected payment method validates — this prevents an incomplete or malformed order from ever reaching the server.</w:t>
+        <w:t xml:space="preserve">The Place Order button stays disabled (greyed out) until every required field (including a valid Phone) and every field for the selected payment method validates — this prevents an incomplete or malformed order from ever reaching the server.</w:t>
       </w:r>
     </w:p>
     <w:p>
@@ -2375,7 +2403,7 @@
         <w:drawing>
           <wp:inline xmlns:a="http://schemas.openxmlformats.org/drawingml/2006/main" xmlns:pic="http://schemas.openxmlformats.org/drawingml/2006/picture">
             <wp:extent cx="5715000" cy="3571875"/>
-            <wp:docPr id="9007" name="Picture 9007"/>
+            <wp:docPr id="9007" name="Picture 9007" descr="Checkout page with Mock Card selected, showing contact details, delivery address and card fields"/>
             <wp:cNvGraphicFramePr>
               <a:graphicFrameLocks noChangeAspect="1"/>
             </wp:cNvGraphicFramePr>
@@ -2383,11 +2411,11 @@
               <a:graphicData uri="http://schemas.openxmlformats.org/drawingml/2006/picture">
                 <pic:pic>
                   <pic:nvPicPr>
-                    <pic:cNvPr id="0" name="customer-checkout-card.png"/>
+                    <pic:cNvPr id="0" name="v3-customer-checkout-card.png"/>
                     <pic:cNvPicPr/>
                   </pic:nvPicPr>
                   <pic:blipFill>
-                    <a:blip r:embed="rId38"/>
+                    <a:blip r:embed="rId9"/>
                     <a:stretch>
                       <a:fillRect/>
                     </a:stretch>
@@ -2419,7 +2447,7 @@
           <w:sz w:val="20"/>
           <w:szCs w:val="20"/>
         </w:rPr>
-        <w:t>Figure 3.6 — Checkout with Mock Card selected: Contact details, the Address 1/2/City/State/Pincode delivery address form, card number/expiry/cardholder-name fields, and the persistent cart panel's order summary and Place Order button on the right.</w:t>
+        <w:t xml:space="preserve">Figure 3.6 — Checkout with Mock Card selected: Contact details (name, email and Phone), the Address 1/2/City/State/Pincode delivery address form, card number/expiry/cardholder-name fields, and the persistent cart panel's order summary and Place Order button on the right.</w:t>
       </w:r>
     </w:p>
     <w:p>
@@ -2431,7 +2459,7 @@
         <w:drawing>
           <wp:inline xmlns:a="http://schemas.openxmlformats.org/drawingml/2006/main" xmlns:pic="http://schemas.openxmlformats.org/drawingml/2006/picture">
             <wp:extent cx="5715000" cy="3571875"/>
-            <wp:docPr id="9008" name="Picture 9008"/>
+            <wp:docPr id="9008" name="Picture 9008" descr="Checkout page with Mock UPI selected, showing the UPI ID field"/>
             <wp:cNvGraphicFramePr>
               <a:graphicFrameLocks noChangeAspect="1"/>
             </wp:cNvGraphicFramePr>
@@ -2439,11 +2467,11 @@
               <a:graphicData uri="http://schemas.openxmlformats.org/drawingml/2006/picture">
                 <pic:pic>
                   <pic:nvPicPr>
-                    <pic:cNvPr id="0" name="customer-checkout-upi.png"/>
+                    <pic:cNvPr id="0" name="v3-customer-checkout-upi.png"/>
                     <pic:cNvPicPr/>
                   </pic:nvPicPr>
                   <pic:blipFill>
-                    <a:blip r:embed="rId39"/>
+                    <a:blip r:embed="rId10"/>
                     <a:stretch>
                       <a:fillRect/>
                     </a:stretch>
@@ -2480,236 +2508,6 @@
     </w:p>
     <w:p>
       <w:pPr>
-        <w:pStyle w:val="Heading3"/>
-        <w:spacing w:before="200" w:after="100"/>
-      </w:pPr>
-      <w:r>
-        <w:rPr>
-          <w:b/>
-          <w:bCs/>
-          <w:color w:val="3A4A6B"/>
-        </w:rPr>
-        <w:t xml:space="preserve">Payment methods explained</w:t>
-      </w:r>
-    </w:p>
-    <w:p>
-      <w:pPr>
-        <w:pStyle w:val="ListParagraph"/>
-        <w:numPr>
-          <w:ilvl w:val="0"/>
-          <w:numId w:val="1"/>
-        </w:numPr>
-        <w:spacing w:after="80"/>
-      </w:pPr>
-      <w:r>
-        <w:rPr>
-          <w:color w:val="1A1A1A"/>
-        </w:rPr>
-        <w:t xml:space="preserve">Mock Card — requires a 16-digit card number, an MM/YY expiry, and a cardholder name. Resolves to success or failure at random, roughly an 80% success rate, to simulate a real payment gateway.</w:t>
-      </w:r>
-    </w:p>
-    <w:p>
-      <w:pPr>
-        <w:pStyle w:val="ListParagraph"/>
-        <w:numPr>
-          <w:ilvl w:val="0"/>
-          <w:numId w:val="1"/>
-        </w:numPr>
-        <w:spacing w:after="80"/>
-      </w:pPr>
-      <w:r>
-        <w:rPr>
-          <w:color w:val="1A1A1A"/>
-        </w:rPr>
-        <w:t xml:space="preserve">Mock UPI — requires a UPI ID (e.g. name@bank). Same ~80% success/failure simulation as Mock Card.</w:t>
-      </w:r>
-    </w:p>
-    <w:p>
-      <w:pPr>
-        <w:pStyle w:val="ListParagraph"/>
-        <w:numPr>
-          <w:ilvl w:val="0"/>
-          <w:numId w:val="1"/>
-        </w:numPr>
-        <w:spacing w:after="80"/>
-      </w:pPr>
-      <w:r>
-        <w:rPr>
-          <w:color w:val="1A1A1A"/>
-        </w:rPr>
-        <w:t xml:space="preserve">Cash on Delivery — no extra fields required, and always succeeds immediately, since payment happens in person at delivery.</w:t>
-      </w:r>
-    </w:p>
-    <w:p>
-      <w:pPr>
-        <w:pBdr>
-          <w:left w:val="single" w:color="E8871E" w:sz="24" w:space="8"/>
-        </w:pBdr>
-        <w:shd w:fill="FDF1E3" w:val="clear"/>
-        <w:spacing w:before="120" w:after="200"/>
-        <w:ind w:left="200"/>
-      </w:pPr>
-      <w:r>
-        <w:rPr>
-          <w:i/>
-          <w:iCs/>
-          <w:color w:val="6B4A15"/>
-        </w:rPr>
-        <w:t xml:space="preserve">All prices throughout the platform are calculated and stored to the exact paisa (1/100 of a rupee) using integer arithmetic, never floating-point multiplication — this avoids the rounding errors that plain JavaScript float math would otherwise introduce into money calculations.</w:t>
-      </w:r>
-    </w:p>
-    <w:p>
-      <w:pPr>
-        <w:spacing w:after="160"/>
-      </w:pPr>
-      <w:r>
-        <w:rPr>
-          <w:color w:val="1A1A1A"/>
-        </w:rPr>
-        <w:t xml:space="preserve">Placing an order is processed atomically on the server: the order row, its line items, and the payment record are all created together through a single database transaction (a Postgres function reserved for the server's own privileged connection), so a partial failure midway through checkout cannot leave a half-created order behind. If a local n8n automation instance is running, it resolves the mock payment within a few seconds; if not, the checkout route itself waits out a ~10-second timeout and then resolves the payment in-process, so every order completes correctly either way — just faster with n8n connected.</w:t>
-      </w:r>
-    </w:p>
-    <w:p>
-      <w:pPr>
-        <w:pStyle w:val="Heading3"/>
-        <w:spacing w:before="200" w:after="100"/>
-      </w:pPr>
-      <w:r>
-        <w:rPr>
-          <w:b/>
-          <w:bCs/>
-          <w:color w:val="3A4A6B"/>
-        </w:rPr>
-        <w:t xml:space="preserve">Step by step: completing checkout</w:t>
-      </w:r>
-    </w:p>
-    <w:p>
-      <w:pPr>
-        <w:spacing w:after="80"/>
-        <w:ind w:left="360"/>
-      </w:pPr>
-      <w:r>
-        <w:rPr>
-          <w:b/>
-          <w:bCs/>
-          <w:color w:val="1B2A4A"/>
-        </w:rPr>
-        <w:t xml:space="preserve">1. </w:t>
-      </w:r>
-      <w:r>
-        <w:rPr>
-          <w:color w:val="1A1A1A"/>
-        </w:rPr>
-        <w:t xml:space="preserve">Fill in or confirm your recipient name and email under Contact details.</w:t>
-      </w:r>
-    </w:p>
-    <w:p>
-      <w:pPr>
-        <w:spacing w:after="80"/>
-        <w:ind w:left="360"/>
-      </w:pPr>
-      <w:r>
-        <w:rPr>
-          <w:b/>
-          <w:bCs/>
-          <w:color w:val="1B2A4A"/>
-        </w:rPr>
-        <w:t xml:space="preserve">2. </w:t>
-      </w:r>
-      <w:r>
-        <w:rPr>
-          <w:color w:val="1A1A1A"/>
-        </w:rPr>
-        <w:t xml:space="preserve">Choose a payment method and fill in its required fields.</w:t>
-      </w:r>
-    </w:p>
-    <w:p>
-      <w:pPr>
-        <w:spacing w:after="80"/>
-        <w:ind w:left="360"/>
-      </w:pPr>
-      <w:r>
-        <w:rPr>
-          <w:b/>
-          <w:bCs/>
-          <w:color w:val="1B2A4A"/>
-        </w:rPr>
-        <w:t xml:space="preserve">3. </w:t>
-      </w:r>
-      <w:r>
-        <w:rPr>
-          <w:color w:val="1A1A1A"/>
-        </w:rPr>
-        <w:t xml:space="preserve">Review the order summary — line items, subtotal, delivery fee, and total — on the right.</w:t>
-      </w:r>
-    </w:p>
-    <w:p>
-      <w:pPr>
-        <w:spacing w:after="80"/>
-        <w:ind w:left="360"/>
-      </w:pPr>
-      <w:r>
-        <w:rPr>
-          <w:b/>
-          <w:bCs/>
-          <w:color w:val="1B2A4A"/>
-        </w:rPr>
-        <w:t xml:space="preserve">4. </w:t>
-      </w:r>
-      <w:r>
-        <w:rPr>
-          <w:color w:val="1A1A1A"/>
-        </w:rPr>
-        <w:t xml:space="preserve">Select Place Order once the button is enabled.</w:t>
-      </w:r>
-    </w:p>
-    <w:p>
-      <w:pPr>
-        <w:spacing w:after="80"/>
-        <w:ind w:left="360"/>
-      </w:pPr>
-      <w:r>
-        <w:rPr>
-          <w:b/>
-          <w:bCs/>
-          <w:color w:val="1B2A4A"/>
-        </w:rPr>
-        <w:t xml:space="preserve">5. </w:t>
-      </w:r>
-      <w:r>
-        <w:rPr>
-          <w:color w:val="1A1A1A"/>
-        </w:rPr>
-        <w:t xml:space="preserve">Wait for payment to resolve; you are then taken to the order confirmation page.</w:t>
-      </w:r>
-    </w:p>
-    <w:p>
-      <w:pPr>
-        <w:pStyle w:val="Heading2"/>
-        <w:spacing w:before="300" w:after="150"/>
-      </w:pPr>
-      <w:r>
-        <w:rPr>
-          <w:b/>
-          <w:bCs/>
-          <w:color w:val="E8871E"/>
-        </w:rPr>
-        <w:t xml:space="preserve">3.5 Order Confirmation &amp; Tracking</w:t>
-      </w:r>
-    </w:p>
-    <w:p>
-      <w:pPr>
-        <w:spacing w:after="160"/>
-      </w:pPr>
-      <w:r>
-        <w:rPr>
-          <w:color w:val="1A1A1A"/>
-        </w:rPr>
-        <w:t xml:space="preserve">After a successful checkout, the customer lands on that order's confirmation page, which shows a four-step status timeline — Placed, Preparing, On the way, Delivered — instead of a plain text status line. Once a delivery partner is assigned to the order, a bordered coordinate box shows their last reported location in place of a live map (no Google Maps key is configured in this environment, so this is a readable stand-in rather than an interactive map).</w:t>
-      </w:r>
-    </w:p>
-    <w:p>
-      <w:pPr>
         <w:spacing w:before="200" w:after="80"/>
         <w:jc w:val="center"/>
       </w:pPr>
@@ -2717,7 +2515,7 @@
         <w:drawing>
           <wp:inline xmlns:a="http://schemas.openxmlformats.org/drawingml/2006/main" xmlns:pic="http://schemas.openxmlformats.org/drawingml/2006/picture">
             <wp:extent cx="5715000" cy="3571875"/>
-            <wp:docPr id="9009" name="Picture 9009"/>
+            <wp:docPr id="9501" name="Picture 9501" descr="Checkout page with Cash on Delivery selected and the required Phone field filled in"/>
             <wp:cNvGraphicFramePr>
               <a:graphicFrameLocks noChangeAspect="1"/>
             </wp:cNvGraphicFramePr>
@@ -2725,11 +2523,11 @@
               <a:graphicData uri="http://schemas.openxmlformats.org/drawingml/2006/picture">
                 <pic:pic>
                   <pic:nvPicPr>
-                    <pic:cNvPr id="0" name="customer-order-confirmation.png"/>
+                    <pic:cNvPr id="0" name="v3-customer-checkout-phone.png"/>
                     <pic:cNvPicPr/>
                   </pic:nvPicPr>
                   <pic:blipFill>
-                    <a:blip r:embed="rId40"/>
+                    <a:blip r:embed="rId11"/>
                     <a:stretch>
                       <a:fillRect/>
                     </a:stretch>
@@ -2761,7 +2559,87 @@
           <w:sz w:val="20"/>
           <w:szCs w:val="20"/>
         </w:rPr>
-        <w:t xml:space="preserve">Figure 3.8 — Order confirmation page for a freshly placed Cash on Delivery order, showing the order's line items, totals, and current status.</w:t>
+        <w:t xml:space="preserve">Figure 3.7a — Checkout with Cash on Delivery selected: the required Phone field under Contact details, the delivery address form, and the order summary on the right. No extra fields are needed for Cash on Delivery.</w:t>
+      </w:r>
+    </w:p>
+    <w:p>
+      <w:pPr>
+        <w:pStyle w:val="Heading3"/>
+        <w:spacing w:before="200" w:after="100"/>
+      </w:pPr>
+      <w:r>
+        <w:rPr>
+          <w:b/>
+          <w:bCs/>
+          <w:color w:val="3A4A6B"/>
+        </w:rPr>
+        <w:t xml:space="preserve">Payment methods explained</w:t>
+      </w:r>
+    </w:p>
+    <w:p>
+      <w:pPr>
+        <w:pStyle w:val="ListParagraph"/>
+        <w:numPr>
+          <w:ilvl w:val="0"/>
+          <w:numId w:val="1"/>
+        </w:numPr>
+        <w:spacing w:after="80"/>
+      </w:pPr>
+      <w:r>
+        <w:rPr>
+          <w:color w:val="1A1A1A"/>
+        </w:rPr>
+        <w:t xml:space="preserve">Mock Card — requires a 16-digit card number, an MM/YY expiry, and a cardholder name. Resolves to success or failure at random, roughly an 80% success rate, to simulate a real payment gateway.</w:t>
+      </w:r>
+    </w:p>
+    <w:p>
+      <w:pPr>
+        <w:pStyle w:val="ListParagraph"/>
+        <w:numPr>
+          <w:ilvl w:val="0"/>
+          <w:numId w:val="1"/>
+        </w:numPr>
+        <w:spacing w:after="80"/>
+      </w:pPr>
+      <w:r>
+        <w:rPr>
+          <w:color w:val="1A1A1A"/>
+        </w:rPr>
+        <w:t xml:space="preserve">Mock UPI — requires a UPI ID (e.g. name@bank). Same ~80% success/failure simulation as Mock Card.</w:t>
+      </w:r>
+    </w:p>
+    <w:p>
+      <w:pPr>
+        <w:pStyle w:val="ListParagraph"/>
+        <w:numPr>
+          <w:ilvl w:val="0"/>
+          <w:numId w:val="1"/>
+        </w:numPr>
+        <w:spacing w:after="80"/>
+      </w:pPr>
+      <w:r>
+        <w:rPr>
+          <w:color w:val="1A1A1A"/>
+        </w:rPr>
+        <w:t xml:space="preserve">Cash on Delivery — no extra fields required, and always succeeds immediately, since payment happens in person at delivery.</w:t>
+      </w:r>
+    </w:p>
+    <w:p>
+      <w:pPr>
+        <w:pBdr>
+          <w:left w:val="single" w:color="E8871E" w:sz="24" w:space="8"/>
+        </w:pBdr>
+        <w:shd w:fill="FDF1E3" w:val="clear"/>
+        <w:spacing w:before="120" w:after="200"/>
+        <w:ind w:left="200"/>
+      </w:pPr>
+      <w:r>
+        <w:rPr>
+          <w:i/>
+          <w:iCs/>
+          <w:color w:val="6B4A15"/>
+        </w:rPr>
+        <w:t xml:space="preserve">All prices throughout the platform are calculated and stored to the exact paisa (1/100 of a rupee) using integer arithmetic, never floating-point multiplication — this avoids the rounding errors that plain JavaScript float math would otherwise introduce into money calculations.</w:t>
       </w:r>
     </w:p>
     <w:p>
@@ -2772,7 +2650,456 @@
         <w:rPr>
           <w:color w:val="1A1A1A"/>
         </w:rPr>
-        <w:t xml:space="preserve">The confirmation page polls the server periodically for status updates and stops polling once the order reaches a terminal state (Delivered or Cancelled), so it does not poll forever after the order journey has ended.</w:t>
+        <w:t xml:space="preserve">Placing an order is processed atomically on the server: the order row, its line items, and the payment record are all created together through a single database transaction (a Postgres function reserved for the server's own privileged connection), so a partial failure midway through checkout cannot leave a half-created order behind. If a local n8n automation instance is running, it resolves the mock payment within a few seconds; if not, the checkout route itself waits out a ~10-second timeout and then resolves the payment in-process, so every order completes correctly either way — just faster with n8n connected.</w:t>
+      </w:r>
+    </w:p>
+    <w:p>
+      <w:pPr>
+        <w:pStyle w:val="Heading3"/>
+        <w:spacing w:before="200" w:after="100"/>
+      </w:pPr>
+      <w:r>
+        <w:rPr>
+          <w:b/>
+          <w:bCs/>
+          <w:color w:val="3A4A6B"/>
+        </w:rPr>
+        <w:t xml:space="preserve">Step by step: completing checkout</w:t>
+      </w:r>
+    </w:p>
+    <w:p>
+      <w:pPr>
+        <w:spacing w:after="80"/>
+        <w:ind w:left="360"/>
+      </w:pPr>
+      <w:r>
+        <w:rPr>
+          <w:b/>
+          <w:bCs/>
+          <w:color w:val="1B2A4A"/>
+        </w:rPr>
+        <w:t xml:space="preserve">1. </w:t>
+      </w:r>
+      <w:r>
+        <w:rPr>
+          <w:color w:val="1A1A1A"/>
+        </w:rPr>
+        <w:t xml:space="preserve">Fill in or confirm your recipient name and email under Contact details.</w:t>
+      </w:r>
+    </w:p>
+    <w:p>
+      <w:pPr>
+        <w:spacing w:after="80"/>
+        <w:ind w:left="360"/>
+      </w:pPr>
+      <w:r>
+        <w:rPr>
+          <w:b/>
+          <w:bCs/>
+          <w:color w:val="1B2A4A"/>
+        </w:rPr>
+        <w:t xml:space="preserve">2. </w:t>
+      </w:r>
+      <w:r>
+        <w:rPr>
+          <w:color w:val="1A1A1A"/>
+        </w:rPr>
+        <w:t xml:space="preserve">Enter your Phone number (required): a 10-digit Indian mobile number, with or without +91, 91 or 0 in front.</w:t>
+      </w:r>
+    </w:p>
+    <w:p>
+      <w:pPr>
+        <w:spacing w:after="80"/>
+        <w:ind w:left="360"/>
+      </w:pPr>
+      <w:r>
+        <w:rPr>
+          <w:b/>
+          <w:bCs/>
+          <w:color w:val="1B2A4A"/>
+        </w:rPr>
+        <w:t xml:space="preserve">3. </w:t>
+      </w:r>
+      <w:r>
+        <w:rPr>
+          <w:color w:val="1A1A1A"/>
+        </w:rPr>
+        <w:t xml:space="preserve">Choose a payment method and fill in its required fields.</w:t>
+      </w:r>
+    </w:p>
+    <w:p>
+      <w:pPr>
+        <w:spacing w:after="80"/>
+        <w:ind w:left="360"/>
+      </w:pPr>
+      <w:r>
+        <w:rPr>
+          <w:b/>
+          <w:bCs/>
+          <w:color w:val="1B2A4A"/>
+        </w:rPr>
+        <w:t xml:space="preserve">4. </w:t>
+      </w:r>
+      <w:r>
+        <w:rPr>
+          <w:color w:val="1A1A1A"/>
+        </w:rPr>
+        <w:t xml:space="preserve">Review the order summary — line items, subtotal, delivery fee, and total — on the right.</w:t>
+      </w:r>
+    </w:p>
+    <w:p>
+      <w:pPr>
+        <w:spacing w:after="80"/>
+        <w:ind w:left="360"/>
+      </w:pPr>
+      <w:r>
+        <w:rPr>
+          <w:b/>
+          <w:bCs/>
+          <w:color w:val="1B2A4A"/>
+        </w:rPr>
+        <w:t xml:space="preserve">5. </w:t>
+      </w:r>
+      <w:r>
+        <w:rPr>
+          <w:color w:val="1A1A1A"/>
+        </w:rPr>
+        <w:t xml:space="preserve">Select Place Order once the button is enabled.</w:t>
+      </w:r>
+    </w:p>
+    <w:p>
+      <w:pPr>
+        <w:spacing w:after="80"/>
+        <w:ind w:left="360"/>
+      </w:pPr>
+      <w:r>
+        <w:rPr>
+          <w:b/>
+          <w:bCs/>
+          <w:color w:val="1B2A4A"/>
+        </w:rPr>
+        <w:t xml:space="preserve">6. </w:t>
+      </w:r>
+      <w:r>
+        <w:rPr>
+          <w:color w:val="1A1A1A"/>
+        </w:rPr>
+        <w:t xml:space="preserve">Wait for payment to resolve; you are then taken to the order's detail page.</w:t>
+      </w:r>
+    </w:p>
+    <w:p>
+      <w:pPr>
+        <w:pStyle w:val="Heading2"/>
+        <w:spacing w:before="300" w:after="150"/>
+      </w:pPr>
+      <w:r>
+        <w:rPr>
+          <w:b/>
+          <w:bCs/>
+          <w:color w:val="E8871E"/>
+        </w:rPr>
+        <w:t xml:space="preserve">3.5 Orders, Order Detail &amp; Tracking</w:t>
+      </w:r>
+    </w:p>
+    <w:p>
+      <w:pPr>
+        <w:spacing w:after="160"/>
+      </w:pPr>
+      <w:r>
+        <w:rPr>
+          <w:color w:val="1A1A1A"/>
+        </w:rPr>
+        <w:t xml:space="preserve">After a successful checkout, the customer lands on that order's detail page. At the top is a six-step tracker — Placed, Accepted, Preparing, Ready, On the way, Delivered — with a one-line description of the current step. Once a delivery partner accepts the order its status reads Partner assigned, and once the partner has picked it up it reads On the way (these two labels replace the single "Out for delivery" status of earlier versions). A rejected or cancelled order shows a red banner in place of the tracker. Once a partner is assigned, a bordered coordinate box shows their last reported location in place of a live map (no Google Maps key is configured in this environment, so this is a readable stand-in rather than an interactive map).</w:t>
+      </w:r>
+    </w:p>
+    <w:p>
+      <w:pPr>
+        <w:spacing w:before="200" w:after="80"/>
+        <w:jc w:val="center"/>
+      </w:pPr>
+      <w:r>
+        <w:drawing>
+          <wp:inline xmlns:a="http://schemas.openxmlformats.org/drawingml/2006/main" xmlns:pic="http://schemas.openxmlformats.org/drawingml/2006/picture">
+            <wp:extent cx="5715000" cy="3571875"/>
+            <wp:docPr id="9009" name="Picture 9009" descr="Order detail page for a freshly placed order, showing the tracker at Placed, deliver-to card, items, totals and payment"/>
+            <wp:cNvGraphicFramePr>
+              <a:graphicFrameLocks noChangeAspect="1"/>
+            </wp:cNvGraphicFramePr>
+            <a:graphic>
+              <a:graphicData uri="http://schemas.openxmlformats.org/drawingml/2006/picture">
+                <pic:pic>
+                  <pic:nvPicPr>
+                    <pic:cNvPr id="0" name="v3-customer-order-detail-placed.png"/>
+                    <pic:cNvPicPr/>
+                  </pic:nvPicPr>
+                  <pic:blipFill>
+                    <a:blip r:embed="rId12"/>
+                    <a:stretch>
+                      <a:fillRect/>
+                    </a:stretch>
+                  </pic:blipFill>
+                  <pic:spPr>
+                    <a:xfrm>
+                      <a:off x="0" y="0"/>
+                      <a:ext cx="5715000" cy="3571875"/>
+                    </a:xfrm>
+                    <a:prstGeom prst="rect"/>
+                  </pic:spPr>
+                </pic:pic>
+              </a:graphicData>
+            </a:graphic>
+          </wp:inline>
+        </w:drawing>
+      </w:r>
+    </w:p>
+    <w:p>
+      <w:pPr>
+        <w:spacing w:after="240"/>
+        <w:jc w:val="center"/>
+      </w:pPr>
+      <w:r>
+        <w:rPr>
+          <w:i/>
+          <w:iCs/>
+          <w:color w:val="5A6472"/>
+          <w:sz w:val="20"/>
+          <w:szCs w:val="20"/>
+        </w:rPr>
+        <w:t xml:space="preserve">Figure 3.8 — Order detail page for a freshly placed Cash on Delivery order: the six-step tracker at Placed, the deliver-to card, the order's items with photos, and the subtotal, delivery fee, total and payment.</w:t>
+      </w:r>
+    </w:p>
+    <w:p>
+      <w:pPr>
+        <w:spacing w:after="160"/>
+      </w:pPr>
+      <w:r>
+        <w:rPr>
+          <w:color w:val="1A1A1A"/>
+        </w:rPr>
+        <w:t xml:space="preserve">Below the tracker the page shows a Deliver to card (name, email, phone and address), the Items with photos and line prices, Subtotal, Delivery fee and Total tiles beside a Payment tile (for example "Paid · Cash on delivery"), and a Timeline listing the time each stage was reached.</w:t>
+      </w:r>
+    </w:p>
+    <w:p>
+      <w:pPr>
+        <w:spacing w:after="160"/>
+      </w:pPr>
+      <w:r>
+        <w:rPr>
+          <w:color w:val="1A1A1A"/>
+        </w:rPr>
+        <w:t xml:space="preserve">The order detail page polls the server periodically for status updates and stops polling once the order reaches a terminal state (Delivered, Rejected or Cancelled), so it does not poll forever after the order journey has ended.</w:t>
+      </w:r>
+    </w:p>
+    <w:p>
+      <w:pPr>
+        <w:spacing w:after="160"/>
+      </w:pPr>
+      <w:r>
+        <w:rPr>
+          <w:color w:val="1A1A1A"/>
+        </w:rPr>
+        <w:t xml:space="preserve">To find an order later, choose Orders in the left sidebar. The Orders list shows every order you have placed, newest first: the store name, order number and date, a status pill, thumbnails of the items with an item count, and the total. Select any order to open its detail page.</w:t>
+      </w:r>
+    </w:p>
+    <w:p>
+      <w:pPr>
+        <w:spacing w:before="200" w:after="80"/>
+        <w:jc w:val="center"/>
+      </w:pPr>
+      <w:r>
+        <w:drawing>
+          <wp:inline xmlns:a="http://schemas.openxmlformats.org/drawingml/2006/main" xmlns:pic="http://schemas.openxmlformats.org/drawingml/2006/picture">
+            <wp:extent cx="5715000" cy="3571875"/>
+            <wp:docPr id="9502" name="Picture 9502" descr="Customer Orders list showing orders with store, date, status pill, item thumbnails and totals"/>
+            <wp:cNvGraphicFramePr>
+              <a:graphicFrameLocks noChangeAspect="1"/>
+            </wp:cNvGraphicFramePr>
+            <a:graphic>
+              <a:graphicData uri="http://schemas.openxmlformats.org/drawingml/2006/picture">
+                <pic:pic>
+                  <pic:nvPicPr>
+                    <pic:cNvPr id="0" name="v3-customer-orders-list.png"/>
+                    <pic:cNvPicPr/>
+                  </pic:nvPicPr>
+                  <pic:blipFill>
+                    <a:blip r:embed="rId13"/>
+                    <a:stretch>
+                      <a:fillRect/>
+                    </a:stretch>
+                  </pic:blipFill>
+                  <pic:spPr>
+                    <a:xfrm>
+                      <a:off x="0" y="0"/>
+                      <a:ext cx="5715000" cy="3571875"/>
+                    </a:xfrm>
+                    <a:prstGeom prst="rect"/>
+                  </pic:spPr>
+                </pic:pic>
+              </a:graphicData>
+            </a:graphic>
+          </wp:inline>
+        </w:drawing>
+      </w:r>
+    </w:p>
+    <w:p>
+      <w:pPr>
+        <w:spacing w:after="240"/>
+        <w:jc w:val="center"/>
+      </w:pPr>
+      <w:r>
+        <w:rPr>
+          <w:i/>
+          <w:iCs/>
+          <w:color w:val="5A6472"/>
+          <w:sz w:val="20"/>
+          <w:szCs w:val="20"/>
+        </w:rPr>
+        <w:t xml:space="preserve">Figure 3.8a — The Orders list: one card per order with the store, order number and date, a status pill (Placed, Partner assigned, Delivered, and so on), item thumbnails with a count, and the total.</w:t>
+      </w:r>
+    </w:p>
+    <w:p>
+      <w:pPr>
+        <w:spacing w:after="160"/>
+      </w:pPr>
+      <w:r>
+        <w:rPr>
+          <w:color w:val="1A1A1A"/>
+        </w:rPr>
+        <w:t xml:space="preserve">As the order progresses the tracker ticks off each step. While the order is On the way the first four steps are ticked, step 5 is highlighted, and the partner's last reported location appears above the order summary.</w:t>
+      </w:r>
+    </w:p>
+    <w:p>
+      <w:pPr>
+        <w:spacing w:before="200" w:after="80"/>
+        <w:jc w:val="center"/>
+      </w:pPr>
+      <w:r>
+        <w:drawing>
+          <wp:inline xmlns:a="http://schemas.openxmlformats.org/drawingml/2006/main" xmlns:pic="http://schemas.openxmlformats.org/drawingml/2006/picture">
+            <wp:extent cx="5715000" cy="3571875"/>
+            <wp:docPr id="9503" name="Picture 9503" descr="Order detail page with the tracker at step 5, On the way, and the partner location box"/>
+            <wp:cNvGraphicFramePr>
+              <a:graphicFrameLocks noChangeAspect="1"/>
+            </wp:cNvGraphicFramePr>
+            <a:graphic>
+              <a:graphicData uri="http://schemas.openxmlformats.org/drawingml/2006/picture">
+                <pic:pic>
+                  <pic:nvPicPr>
+                    <pic:cNvPr id="0" name="v3-customer-order-detail-ontheway.png"/>
+                    <pic:cNvPicPr/>
+                  </pic:nvPicPr>
+                  <pic:blipFill>
+                    <a:blip r:embed="rId14"/>
+                    <a:stretch>
+                      <a:fillRect/>
+                    </a:stretch>
+                  </pic:blipFill>
+                  <pic:spPr>
+                    <a:xfrm>
+                      <a:off x="0" y="0"/>
+                      <a:ext cx="5715000" cy="3571875"/>
+                    </a:xfrm>
+                    <a:prstGeom prst="rect"/>
+                  </pic:spPr>
+                </pic:pic>
+              </a:graphicData>
+            </a:graphic>
+          </wp:inline>
+        </w:drawing>
+      </w:r>
+    </w:p>
+    <w:p>
+      <w:pPr>
+        <w:spacing w:after="240"/>
+        <w:jc w:val="center"/>
+      </w:pPr>
+      <w:r>
+        <w:rPr>
+          <w:i/>
+          <w:iCs/>
+          <w:color w:val="5A6472"/>
+          <w:sz w:val="20"/>
+          <w:szCs w:val="20"/>
+        </w:rPr>
+        <w:t xml:space="preserve">Figure 3.8b — Order detail while the order is On the way: steps 1 to 4 are ticked, step 5 is highlighted, and the order summary follows the partner location box.</w:t>
+      </w:r>
+    </w:p>
+    <w:p>
+      <w:pPr>
+        <w:spacing w:after="160"/>
+      </w:pPr>
+      <w:r>
+        <w:rPr>
+          <w:color w:val="1A1A1A"/>
+        </w:rPr>
+        <w:t xml:space="preserve">Once the order is delivered the status pill turns green and the Timeline records the time of each stage reached (Placed, Accepted, Picked up and Delivered). The Subtotal, Delivery fee and Total tiles and the Payment tile stay on the page for reference.</w:t>
+      </w:r>
+    </w:p>
+    <w:p>
+      <w:pPr>
+        <w:spacing w:before="200" w:after="80"/>
+        <w:jc w:val="center"/>
+      </w:pPr>
+      <w:r>
+        <w:drawing>
+          <wp:inline xmlns:a="http://schemas.openxmlformats.org/drawingml/2006/main" xmlns:pic="http://schemas.openxmlformats.org/drawingml/2006/picture">
+            <wp:extent cx="5715000" cy="3571875"/>
+            <wp:docPr id="9504" name="Picture 9504" descr="Order detail page for a delivered order showing deliver-to card, items, totals, payment and timeline"/>
+            <wp:cNvGraphicFramePr>
+              <a:graphicFrameLocks noChangeAspect="1"/>
+            </wp:cNvGraphicFramePr>
+            <a:graphic>
+              <a:graphicData uri="http://schemas.openxmlformats.org/drawingml/2006/picture">
+                <pic:pic>
+                  <pic:nvPicPr>
+                    <pic:cNvPr id="0" name="v3-customer-order-detail-delivered.png"/>
+                    <pic:cNvPicPr/>
+                  </pic:nvPicPr>
+                  <pic:blipFill>
+                    <a:blip r:embed="rId15"/>
+                    <a:stretch>
+                      <a:fillRect/>
+                    </a:stretch>
+                  </pic:blipFill>
+                  <pic:spPr>
+                    <a:xfrm>
+                      <a:off x="0" y="0"/>
+                      <a:ext cx="5715000" cy="3571875"/>
+                    </a:xfrm>
+                    <a:prstGeom prst="rect"/>
+                  </pic:spPr>
+                </pic:pic>
+              </a:graphicData>
+            </a:graphic>
+          </wp:inline>
+        </w:drawing>
+      </w:r>
+    </w:p>
+    <w:p>
+      <w:pPr>
+        <w:spacing w:after="240"/>
+        <w:jc w:val="center"/>
+      </w:pPr>
+      <w:r>
+        <w:rPr>
+          <w:i/>
+          <w:iCs/>
+          <w:color w:val="5A6472"/>
+          <w:sz w:val="20"/>
+          <w:szCs w:val="20"/>
+        </w:rPr>
+        <w:t xml:space="preserve">Figure 3.8c — Order detail for a delivered order (scrolled down past the tracker): the deliver-to card, items, totals, payment and the Timeline of times for each stage reached.</w:t>
+      </w:r>
+    </w:p>
+    <w:p>
+      <w:pPr>
+        <w:spacing w:after="160"/>
+      </w:pPr>
+      <w:r>
+        <w:rPr>
+          <w:color w:val="1A1A1A"/>
+        </w:rPr>
+        <w:t xml:space="preserve">Delivered email: when an order is delivered, n8n also emails the address entered at checkout. The subject is "Your order from &lt;store&gt; has been delivered", and the message reads "Thank you for your order. Your order has been successfully delivered. Please let us know your experience." It lists each item with its photo, quantity and options, the subtotal, delivery fee and total, and the name, phone and address it was delivered to. The order-accepted email is sent to the same checkout address.</w:t>
       </w:r>
     </w:p>
     <w:p>
@@ -2880,7 +3207,7 @@
                     </pic:cNvPicPr>
                   </pic:nvPicPr>
                   <pic:blipFill>
-                    <a:blip r:embed="rId18" cstate="none"/>
+                    <a:blip r:embed="rId30" cstate="none"/>
                     <a:srcRect/>
                     <a:stretch>
                       <a:fillRect/>
@@ -2945,7 +3272,7 @@
         <w:rPr>
           <w:color w:val="1A1A1A"/>
         </w:rPr>
-        <w:t>Once signed in, the Sign In / Sign Up buttons in the left sidebar disappear, and the hamburger icon in the top-right of the header opens the account menu: your name, Orders (a full list of your past and current orders — tap one to see its live status), Wallet (the payment methods available at checkout), Help (a short FAQ on how to use the site), and Sign out. Under your name is a Reset password link: click it and a password-reset email is sent to your account address, and the link changes to “Reset email sent”.</w:t>
+        <w:t>Once signed in, the Sign In / Sign Up buttons in the left sidebar disappear, and the hamburger icon in the top-right of the header opens the account menu: your name, Orders (the Orders list of your past and current orders — tap one to open its order detail page and tracker), Wallet (the payment methods available at checkout), Help (a short FAQ on how to use the site), and Sign out. Under your name is a Reset password link: click it and a password-reset email is sent to your account address, and the link changes to “Reset email sent”.</w:t>
       </w:r>
     </w:p>
     <w:p>
@@ -3375,7 +3702,7 @@
       <w:r>
         <w:drawing>
           <wp:inline xmlns:a="http://schemas.openxmlformats.org/drawingml/2006/main" xmlns:pic="http://schemas.openxmlformats.org/drawingml/2006/picture">
-            <wp:extent cx="5715000" cy="9822656"/>
+            <wp:extent cx="4043311" cy="6949440"/>
             <wp:docPr id="9014" name="Picture 9014"/>
             <wp:cNvGraphicFramePr>
               <a:graphicFrameLocks noChangeAspect="1"/>
@@ -3396,7 +3723,7 @@
                   <pic:spPr>
                     <a:xfrm>
                       <a:off x="0" y="0"/>
-                      <a:ext cx="5715000" cy="9822656"/>
+                      <a:ext cx="4043311" cy="6949440"/>
                     </a:xfrm>
                     <a:prstGeom prst="rect"/>
                   </pic:spPr>
@@ -3537,7 +3864,7 @@
         <w:rPr>
           <w:color w:val="1A1A1A"/>
         </w:rPr>
-        <w:t xml:space="preserve">The Orders page shows every incoming order for this store as a kanban board with one column per stage: Placed, Accepted, Preparing, and Ready. A new order appears in the Placed column with Accept and Reject buttons; accepting it moves it to Accepted, from which the vendor advances it forward one stage at a time (Start preparing, then Mark ready) using a single button on the order's card. Once Ready, the order becomes visible to online delivery partners and leaves the vendor's own workflow.</w:t>
+        <w:t xml:space="preserve">The Orders page shows every incoming order for this store as a kanban board with one large, colour-coded column per stage: New, Accepted, Preparing, and Ready (each header shows how many orders it holds, and an empty column reads "Nothing here yet"). The board refreshes itself every 10 seconds. Each card shows the order number and total; who the order is for, their phone number, the payment (for example "Paid · Cash on delivery") and the delivery address; the items with photos and quantities; and any delivery note. A new order appears in the New column with Reject and Accept order buttons; accepting it moves it to Accepted, from which the vendor advances it forward one stage at a time (Start preparing, then Mark ready) using a single button on the order's card. A Full details link on every card opens a dialog with the full order. Once Ready, the order becomes visible to online delivery partners and leaves the vendor's own workflow.</w:t>
       </w:r>
     </w:p>
     <w:p>
@@ -3549,7 +3876,7 @@
         <w:drawing>
           <wp:inline xmlns:a="http://schemas.openxmlformats.org/drawingml/2006/main" xmlns:pic="http://schemas.openxmlformats.org/drawingml/2006/picture">
             <wp:extent cx="5715000" cy="3571875"/>
-            <wp:docPr id="9015" name="Picture 9015"/>
+            <wp:docPr id="9015" name="Picture 9015" descr="Vendor Orders board with New, Accepted, Preparing and Ready columns and order cards"/>
             <wp:cNvGraphicFramePr>
               <a:graphicFrameLocks noChangeAspect="1"/>
             </wp:cNvGraphicFramePr>
@@ -3557,11 +3884,11 @@
               <a:graphicData uri="http://schemas.openxmlformats.org/drawingml/2006/picture">
                 <pic:pic>
                   <pic:nvPicPr>
-                    <pic:cNvPr id="0" name="vendor-orders.png"/>
+                    <pic:cNvPr id="0" name="v3-vendor-orders-board.png"/>
                     <pic:cNvPicPr/>
                   </pic:nvPicPr>
                   <pic:blipFill>
-                    <a:blip r:embed="rId45"/>
+                    <a:blip r:embed="rId16"/>
                     <a:stretch>
                       <a:fillRect/>
                     </a:stretch>
@@ -3593,7 +3920,63 @@
           <w:sz w:val="20"/>
           <w:szCs w:val="20"/>
         </w:rPr>
-        <w:t xml:space="preserve">Figure 4.4 — Vendor Orders kanban board showing a real incoming order in the Placed column with Accept/Reject actions.</w:t>
+        <w:t xml:space="preserve">Figure 4.4 — Vendor Orders board: colour-coded New, Accepted, Preparing and Ready columns. Each card shows who the order is for, phone, payment, address and items with photos, with Reject / Accept order on a new order and a Full details link.</w:t>
+      </w:r>
+    </w:p>
+    <w:p>
+      <w:pPr>
+        <w:spacing w:before="200" w:after="80"/>
+        <w:jc w:val="center"/>
+      </w:pPr>
+      <w:r>
+        <w:drawing>
+          <wp:inline xmlns:a="http://schemas.openxmlformats.org/drawingml/2006/main" xmlns:pic="http://schemas.openxmlformats.org/drawingml/2006/picture">
+            <wp:extent cx="5715000" cy="3571875"/>
+            <wp:docPr id="9505" name="Picture 9505" descr="Full details dialog for an order on the vendor board"/>
+            <wp:cNvGraphicFramePr>
+              <a:graphicFrameLocks noChangeAspect="1"/>
+            </wp:cNvGraphicFramePr>
+            <a:graphic>
+              <a:graphicData uri="http://schemas.openxmlformats.org/drawingml/2006/picture">
+                <pic:pic>
+                  <pic:nvPicPr>
+                    <pic:cNvPr id="0" name="v3-vendor-order-dialog.png"/>
+                    <pic:cNvPicPr/>
+                  </pic:nvPicPr>
+                  <pic:blipFill>
+                    <a:blip r:embed="rId17"/>
+                    <a:stretch>
+                      <a:fillRect/>
+                    </a:stretch>
+                  </pic:blipFill>
+                  <pic:spPr>
+                    <a:xfrm>
+                      <a:off x="0" y="0"/>
+                      <a:ext cx="5715000" cy="3571875"/>
+                    </a:xfrm>
+                    <a:prstGeom prst="rect"/>
+                  </pic:spPr>
+                </pic:pic>
+              </a:graphicData>
+            </a:graphic>
+          </wp:inline>
+        </w:drawing>
+      </w:r>
+    </w:p>
+    <w:p>
+      <w:pPr>
+        <w:spacing w:after="240"/>
+        <w:jc w:val="center"/>
+      </w:pPr>
+      <w:r>
+        <w:rPr>
+          <w:i/>
+          <w:iCs/>
+          <w:color w:val="5A6472"/>
+          <w:sz w:val="20"/>
+          <w:szCs w:val="20"/>
+        </w:rPr>
+        <w:t xml:space="preserve">Figure 4.4a — The Full details dialog: the deliver-to card, items with photos, subtotal, delivery fee, total, payment and the order timeline.</w:t>
       </w:r>
     </w:p>
     <w:p>
@@ -3627,7 +4010,7 @@
         <w:rPr>
           <w:color w:val="1A1A1A"/>
         </w:rPr>
-        <w:t xml:space="preserve">A new order appears in the Placed column — review its items and total.</w:t>
+        <w:t xml:space="preserve">A new order appears in the New column — review who it is for, its items and total (select Full details for the complete order).</w:t>
       </w:r>
     </w:p>
     <w:p>
@@ -3647,7 +4030,7 @@
         <w:rPr>
           <w:color w:val="1A1A1A"/>
         </w:rPr>
-        <w:t xml:space="preserve">Select Accept to take the order, or Reject to decline it (a rejected order is cancelled outright).</w:t>
+        <w:t xml:space="preserve">Select Accept order to take the order, or Reject to decline it (a rejected order is not fulfilled and the customer sees it marked Rejected).</w:t>
       </w:r>
     </w:p>
     <w:p>
@@ -3714,7 +4097,7 @@
                     </pic:cNvPicPr>
                   </pic:nvPicPr>
                   <pic:blipFill>
-                    <a:blip r:embed="rId23" cstate="none"/>
+                    <a:blip r:embed="rId32" cstate="none"/>
                     <a:srcRect/>
                     <a:stretch>
                       <a:fillRect/>
@@ -3849,7 +4232,7 @@
           <w:bCs/>
           <w:color w:val="E8871E"/>
         </w:rPr>
-        <w:t xml:space="preserve">5.1 Delivery Dashboard</w:t>
+        <w:t xml:space="preserve">5.1 Delivery Dashboard &amp; History</w:t>
       </w:r>
     </w:p>
     <w:p>
@@ -3860,7 +4243,7 @@
         <w:rPr>
           <w:color w:val="1A1A1A"/>
         </w:rPr>
-        <w:t>After signing in, a persistent left sidebar shows the partner's online/offline status pill, the Dashboard link, a My Profile section (name, email and a Reset password link) and Sign out. The dashboard beside it is split into two columns:</w:t>
+        <w:t xml:space="preserve">After signing in, a persistent left sidebar shows the partner's online/offline status pill, the Dashboard and History links, a My Profile section (name, email and a Reset password link) and Sign out. The Dashboard shows active work only, in two sections:</w:t>
       </w:r>
     </w:p>
     <w:p>
@@ -3876,7 +4259,7 @@
         <w:rPr>
           <w:color w:val="1A1A1A"/>
         </w:rPr>
-        <w:t xml:space="preserve">Available orders (left) — orders that have reached Ready status and have no delivery partner assigned yet, visible to any online partner on a first-come basis (there is deliberately no admin-assignment step for the first claim — any online partner may claim any available order).</w:t>
+        <w:t xml:space="preserve">Your active deliveries — one card for every order you have accepted that is not yet delivered: the order number and amount, the Pickup store and its address, the Drop-off recipient's name, a tap-to-call phone number and the full address, the items with photos, and a Mark picked up button (then Mark delivered).</w:t>
       </w:r>
     </w:p>
     <w:p>
@@ -3892,7 +4275,7 @@
         <w:rPr>
           <w:color w:val="1A1A1A"/>
         </w:rPr>
-        <w:t xml:space="preserve">Your deliveries (right) — the signed-in partner's own accepted, in-progress, and completed deliveries.</w:t>
+        <w:t xml:space="preserve">Available orders — orders that have reached Ready status and have no delivery partner assigned yet, visible to any online partner on a first-come basis: the store, its pickup address, the items, the amount and an Accept button. The customer's name, phone and address appear only after you accept the order.</w:t>
       </w:r>
     </w:p>
     <w:p>
@@ -3914,8 +4297,8 @@
       <w:r>
         <w:drawing>
           <wp:inline xmlns:a="http://schemas.openxmlformats.org/drawingml/2006/main" xmlns:pic="http://schemas.openxmlformats.org/drawingml/2006/picture">
-            <wp:extent cx="5715000" cy="3571875"/>
-            <wp:docPr id="9017" name="Picture 9017"/>
+            <wp:extent cx="5715000" cy="2312789"/>
+            <wp:docPr id="9017" name="Picture 9017" descr="Delivery dashboard showing an active delivery card with pickup store, drop-off name, phone, address, items and Mark picked up"/>
             <wp:cNvGraphicFramePr>
               <a:graphicFrameLocks noChangeAspect="1"/>
             </wp:cNvGraphicFramePr>
@@ -3923,11 +4306,67 @@
               <a:graphicData uri="http://schemas.openxmlformats.org/drawingml/2006/picture">
                 <pic:pic>
                   <pic:nvPicPr>
-                    <pic:cNvPr id="0" name="delivery-dashboard.png"/>
+                    <pic:cNvPr id="0" name="v3-delivery-dashboard-active-crop.png"/>
                     <pic:cNvPicPr/>
                   </pic:nvPicPr>
                   <pic:blipFill>
-                    <a:blip r:embed="rId47"/>
+                    <a:blip r:embed="rId19"/>
+                    <a:stretch>
+                      <a:fillRect/>
+                    </a:stretch>
+                  </pic:blipFill>
+                  <pic:spPr>
+                    <a:xfrm>
+                      <a:off x="0" y="0"/>
+                      <a:ext cx="5715000" cy="2312789"/>
+                    </a:xfrm>
+                    <a:prstGeom prst="rect"/>
+                  </pic:spPr>
+                </pic:pic>
+              </a:graphicData>
+            </a:graphic>
+          </wp:inline>
+        </w:drawing>
+      </w:r>
+    </w:p>
+    <w:p>
+      <w:pPr>
+        <w:spacing w:after="240"/>
+        <w:jc w:val="center"/>
+      </w:pPr>
+      <w:r>
+        <w:rPr>
+          <w:i/>
+          <w:iCs/>
+          <w:color w:val="5A6472"/>
+          <w:sz w:val="20"/>
+          <w:szCs w:val="20"/>
+        </w:rPr>
+        <w:t xml:space="preserve">Figure 5.2 — Delivery Dashboard, Your active deliveries: each card shows the pickup store, the drop-off name, tap-to-call phone and address, the items, and the next action (Mark picked up); the sidebar shows Dashboard, History and the My Profile section.</w:t>
+      </w:r>
+    </w:p>
+    <w:p>
+      <w:pPr>
+        <w:spacing w:before="200" w:after="80"/>
+        <w:jc w:val="center"/>
+      </w:pPr>
+      <w:r>
+        <w:drawing>
+          <wp:inline xmlns:a="http://schemas.openxmlformats.org/drawingml/2006/main" xmlns:pic="http://schemas.openxmlformats.org/drawingml/2006/picture">
+            <wp:extent cx="5715000" cy="3571875"/>
+            <wp:docPr id="9506" name="Picture 9506" descr="Delivery dashboard Available orders section with an order card and Accept button"/>
+            <wp:cNvGraphicFramePr>
+              <a:graphicFrameLocks noChangeAspect="1"/>
+            </wp:cNvGraphicFramePr>
+            <a:graphic>
+              <a:graphicData uri="http://schemas.openxmlformats.org/drawingml/2006/picture">
+                <pic:pic>
+                  <pic:nvPicPr>
+                    <pic:cNvPr id="0" name="v3-delivery-dashboard-available.png"/>
+                    <pic:cNvPicPr/>
+                  </pic:nvPicPr>
+                  <pic:blipFill>
+                    <a:blip r:embed="rId20"/>
                     <a:stretch>
                       <a:fillRect/>
                     </a:stretch>
@@ -3959,7 +4398,74 @@
           <w:sz w:val="20"/>
           <w:szCs w:val="20"/>
         </w:rPr>
-        <w:t>Figure 5.2 — Delivery dashboard: the online toggle and location fields, with a freshly assigned order under Your deliveries (View address / Mark picked up); the sidebar shows the My Profile section.</w:t>
+        <w:t xml:space="preserve">Figure 5.2a — Available orders: the store, pickup address, items, amount and Accept button. "Customer details appear after you accept."</w:t>
+      </w:r>
+    </w:p>
+    <w:p>
+      <w:pPr>
+        <w:spacing w:after="160"/>
+      </w:pPr>
+      <w:r>
+        <w:rPr>
+          <w:color w:val="1A1A1A"/>
+        </w:rPr>
+        <w:t xml:space="preserve">History (in the sidebar) lists your finished orders — delivered, cancelled or rejected — newest first, up to 50. Each card shows the order number, status and amount, the pickup store, who it was delivered to and when, and the items. History does not show a customer's phone number or address: a partner sees those only while an order is assigned to them or picked up. Refresh reloads the list.</w:t>
+      </w:r>
+    </w:p>
+    <w:p>
+      <w:pPr>
+        <w:spacing w:before="200" w:after="80"/>
+        <w:jc w:val="center"/>
+      </w:pPr>
+      <w:r>
+        <w:drawing>
+          <wp:inline xmlns:a="http://schemas.openxmlformats.org/drawingml/2006/main" xmlns:pic="http://schemas.openxmlformats.org/drawingml/2006/picture">
+            <wp:extent cx="5715000" cy="3571875"/>
+            <wp:docPr id="9507" name="Picture 9507" descr="Delivery partner History page listing finished deliveries"/>
+            <wp:cNvGraphicFramePr>
+              <a:graphicFrameLocks noChangeAspect="1"/>
+            </wp:cNvGraphicFramePr>
+            <a:graphic>
+              <a:graphicData uri="http://schemas.openxmlformats.org/drawingml/2006/picture">
+                <pic:pic>
+                  <pic:nvPicPr>
+                    <pic:cNvPr id="0" name="v3-delivery-history.png"/>
+                    <pic:cNvPicPr/>
+                  </pic:nvPicPr>
+                  <pic:blipFill>
+                    <a:blip r:embed="rId21"/>
+                    <a:stretch>
+                      <a:fillRect/>
+                    </a:stretch>
+                  </pic:blipFill>
+                  <pic:spPr>
+                    <a:xfrm>
+                      <a:off x="0" y="0"/>
+                      <a:ext cx="5715000" cy="3571875"/>
+                    </a:xfrm>
+                    <a:prstGeom prst="rect"/>
+                  </pic:spPr>
+                </pic:pic>
+              </a:graphicData>
+            </a:graphic>
+          </wp:inline>
+        </w:drawing>
+      </w:r>
+    </w:p>
+    <w:p>
+      <w:pPr>
+        <w:spacing w:after="240"/>
+        <w:jc w:val="center"/>
+      </w:pPr>
+      <w:r>
+        <w:rPr>
+          <w:i/>
+          <w:iCs/>
+          <w:color w:val="5A6472"/>
+          <w:sz w:val="20"/>
+          <w:szCs w:val="20"/>
+        </w:rPr>
+        <w:t xml:space="preserve">Figure 5.2b — History: finished deliveries with the pickup store, who each order was delivered to, the time and the items.</w:t>
       </w:r>
     </w:p>
     <w:p>
@@ -4013,7 +4519,7 @@
         <w:rPr>
           <w:color w:val="1A1A1A"/>
         </w:rPr>
-        <w:t xml:space="preserve">Select Claim on any order listed under Available orders — it moves to Your deliveries.</w:t>
+        <w:t xml:space="preserve">Select Accept on any order listed under Available orders — it moves to Your active deliveries and the customer's details appear on its card.</w:t>
       </w:r>
     </w:p>
     <w:p>
@@ -4033,7 +4539,7 @@
         <w:rPr>
           <w:color w:val="1A1A1A"/>
         </w:rPr>
-        <w:t xml:space="preserve">Use View address on the claimed order's card once it reaches Assigned or Picked up to see the customer's delivery address.</w:t>
+        <w:t xml:space="preserve">Use the tap-to-call phone number and the full address on the card to reach the customer.</w:t>
       </w:r>
     </w:p>
     <w:p>
@@ -4053,7 +4559,7 @@
         <w:rPr>
           <w:color w:val="1A1A1A"/>
         </w:rPr>
-        <w:t xml:space="preserve">Advance the order Picked up, then Delivered, from the same card as you progress.</w:t>
+        <w:t xml:space="preserve">Select Mark picked up when you collect the order, then Mark delivered; a delivered order moves to History.</w:t>
       </w:r>
     </w:p>
     <w:p>
@@ -4064,7 +4570,7 @@
         <w:rPr>
           <w:color w:val="1A1A1A"/>
         </w:rPr>
-        <w:t xml:space="preserve">While online, the dashboard automatically sends a location ping every 15 seconds and polls for newly available orders every 10 seconds, so a partner does not need to manually refresh the page to see new work appear. The customer's own order-confirmation page reflects that shared location once the order reaches Assigned, and that access expires automatically once the order is Delivered.</w:t>
+        <w:t xml:space="preserve">While online, the dashboard automatically sends a location ping every 15 seconds and polls for newly available orders every 10 seconds, so a partner does not need to manually refresh the page to see new work appear. The customer's own order detail page reflects that shared location once a partner has accepted the order (Partner assigned), and that access expires automatically once the order is Delivered.</w:t>
       </w:r>
     </w:p>
     <w:p>
@@ -4091,7 +4597,7 @@
                     </pic:cNvPicPr>
                   </pic:nvPicPr>
                   <pic:blipFill>
-                    <a:blip r:embed="rId26" cstate="none"/>
+                    <a:blip r:embed="rId38" cstate="none"/>
                     <a:srcRect/>
                     <a:stretch>
                       <a:fillRect/>
@@ -4156,7 +4662,7 @@
         <w:rPr>
           <w:color w:val="1A1A1A"/>
         </w:rPr>
-        <w:t xml:space="preserve">The admin portal gives platform staff full oversight of the marketplace: every order, every restaurant/store, and every delivery partner, across all four portals. There is no admin self-signup — admin accounts exist only as seeded, pre-provisioned accounts, reflecting that granting admin access is an operational decision, not a public sign-up flow.</w:t>
+        <w:t xml:space="preserve">The admin portal gives platform staff full oversight of the marketplace: every order, every vendor/store, and every delivery partner, across all four portals, and lets them add new vendors and delivery partners. There is no admin self-signup — admin accounts exist only as seeded, pre-provisioned accounts, reflecting that granting admin access is an operational decision, not a public sign-up flow.</w:t>
       </w:r>
     </w:p>
     <w:p>
@@ -4226,7 +4732,7 @@
           <w:bCs/>
           <w:color w:val="E8871E"/>
         </w:rPr>
-        <w:t xml:space="preserve">6.1 Dashboard Layout</w:t>
+        <w:t xml:space="preserve">6.1 Overview &amp; Sidebar</w:t>
       </w:r>
     </w:p>
     <w:p>
@@ -4237,32 +4743,7 @@
         <w:rPr>
           <w:color w:val="1A1A1A"/>
         </w:rPr>
-        <w:t>After signing in, a left sidebar shows Admin, the Dashboard link, a My Profile section (name, email and a Reset password link) and Sign out. The dashboard beside it opens with three summary tiles — Active orders, Vendors and Revenue — above a single tabbed view with three tabs: Orders, Restaurants, and Delivery partners.</w:t>
-      </w:r>
-    </w:p>
-    <w:p>
-      <w:pPr>
-        <w:pStyle w:val="Heading2"/>
-        <w:spacing w:before="300" w:after="150"/>
-      </w:pPr>
-      <w:r>
-        <w:rPr>
-          <w:b/>
-          <w:bCs/>
-          <w:color w:val="E8871E"/>
-        </w:rPr>
-        <w:t xml:space="preserve">6.2 Orders Tab</w:t>
-      </w:r>
-    </w:p>
-    <w:p>
-      <w:pPr>
-        <w:spacing w:after="160"/>
-      </w:pPr>
-      <w:r>
-        <w:rPr>
-          <w:color w:val="1A1A1A"/>
-        </w:rPr>
-        <w:t xml:space="preserve">The Orders tab lists every order on the platform with its restaurant/store, current status, and total. For any order in the Assigned or Picked up status, a reassign dropdown (listing currently-online delivery partners) lets an admin move the order to a different partner — useful if the originally assigned partner goes offline or is unresponsive.</w:t>
+        <w:t xml:space="preserve">After signing in, a left sidebar lists Overview, Orders, Vendors and Delivery Partners, followed by a My Profile section (name, email and a Reset password link) and Sign out. Each item opens its own page. The Overview page shows three summary tiles only — Active orders, Vendors and Revenue (rejected and cancelled orders are not counted in revenue).</w:t>
       </w:r>
     </w:p>
     <w:p>
@@ -4274,7 +4755,7 @@
         <w:drawing>
           <wp:inline xmlns:a="http://schemas.openxmlformats.org/drawingml/2006/main" xmlns:pic="http://schemas.openxmlformats.org/drawingml/2006/picture">
             <wp:extent cx="5715000" cy="3571875"/>
-            <wp:docPr id="9019" name="Picture 9019"/>
+            <wp:docPr id="9508" name="Picture 9508" descr="Admin Overview page with Active orders, Vendors and Revenue tiles and the sidebar"/>
             <wp:cNvGraphicFramePr>
               <a:graphicFrameLocks noChangeAspect="1"/>
             </wp:cNvGraphicFramePr>
@@ -4282,11 +4763,11 @@
               <a:graphicData uri="http://schemas.openxmlformats.org/drawingml/2006/picture">
                 <pic:pic>
                   <pic:nvPicPr>
-                    <pic:cNvPr id="0" name="admin-orders.png"/>
+                    <pic:cNvPr id="0" name="v3-admin-overview.png"/>
                     <pic:cNvPicPr/>
                   </pic:nvPicPr>
                   <pic:blipFill>
-                    <a:blip r:embed="rId49"/>
+                    <a:blip r:embed="rId22"/>
                     <a:stretch>
                       <a:fillRect/>
                     </a:stretch>
@@ -4318,81 +4799,7 @@
           <w:sz w:val="20"/>
           <w:szCs w:val="20"/>
         </w:rPr>
-        <w:t xml:space="preserve">Figure 6.2 — Admin dashboard, Orders tab, listing a real order with its restaurant, status and total.</w:t>
-      </w:r>
-    </w:p>
-    <w:p>
-      <w:pPr>
-        <w:pStyle w:val="Heading3"/>
-        <w:spacing w:before="200" w:after="100"/>
-      </w:pPr>
-      <w:r>
-        <w:rPr>
-          <w:b/>
-          <w:bCs/>
-          <w:color w:val="3A4A6B"/>
-        </w:rPr>
-        <w:t xml:space="preserve">Step by step: reassigning a stuck delivery</w:t>
-      </w:r>
-    </w:p>
-    <w:p>
-      <w:pPr>
-        <w:spacing w:after="80"/>
-        <w:ind w:left="360"/>
-      </w:pPr>
-      <w:r>
-        <w:rPr>
-          <w:b/>
-          <w:bCs/>
-          <w:color w:val="1B2A4A"/>
-        </w:rPr>
-        <w:t xml:space="preserve">1. </w:t>
-      </w:r>
-      <w:r>
-        <w:rPr>
-          <w:color w:val="1A1A1A"/>
-        </w:rPr>
-        <w:t xml:space="preserve">Open the Orders tab and locate the order (it must be Assigned or Picked up).</w:t>
-      </w:r>
-    </w:p>
-    <w:p>
-      <w:pPr>
-        <w:spacing w:after="80"/>
-        <w:ind w:left="360"/>
-      </w:pPr>
-      <w:r>
-        <w:rPr>
-          <w:b/>
-          <w:bCs/>
-          <w:color w:val="1B2A4A"/>
-        </w:rPr>
-        <w:t xml:space="preserve">2. </w:t>
-      </w:r>
-      <w:r>
-        <w:rPr>
-          <w:color w:val="1A1A1A"/>
-        </w:rPr>
-        <w:t xml:space="preserve">Open its reassign dropdown, which lists every currently-online delivery partner.</w:t>
-      </w:r>
-    </w:p>
-    <w:p>
-      <w:pPr>
-        <w:spacing w:after="80"/>
-        <w:ind w:left="360"/>
-      </w:pPr>
-      <w:r>
-        <w:rPr>
-          <w:b/>
-          <w:bCs/>
-          <w:color w:val="1B2A4A"/>
-        </w:rPr>
-        <w:t xml:space="preserve">3. </w:t>
-      </w:r>
-      <w:r>
-        <w:rPr>
-          <w:color w:val="1A1A1A"/>
-        </w:rPr>
-        <w:t xml:space="preserve">Select a different partner — the order updates immediately and the new partner sees it under their own Your deliveries.</w:t>
+        <w:t xml:space="preserve">Figure 6.1a — Admin Overview: the sidebar (Overview, Orders, Vendors, Delivery Partners) and the Active orders, Vendors and Revenue tiles.</w:t>
       </w:r>
     </w:p>
     <w:p>
@@ -4406,7 +4813,7 @@
           <w:bCs/>
           <w:color w:val="E8871E"/>
         </w:rPr>
-        <w:t xml:space="preserve">6.3 Restaurants Tab</w:t>
+        <w:t xml:space="preserve">6.2 Orders and Order Detail</w:t>
       </w:r>
     </w:p>
     <w:p>
@@ -4417,7 +4824,7 @@
         <w:rPr>
           <w:color w:val="1A1A1A"/>
         </w:rPr>
-        <w:t xml:space="preserve">The Restaurants tab lists every store on the platform — 77 in the current seed data, spanning all 11 marketplace categories — with its open/suspended status and a Suspend action. Suspending a store immediately removes it from customer browsing without deleting any of its data; unsuspending brings it back.</w:t>
+        <w:t xml:space="preserve">The Orders page is a table of every order on the platform: the order number (a link), customer, store, a status pill, the amount, the delivery partner (a dash when none is assigned) and the time placed. A status filter at the top right narrows the table to one status. Selecting an order number opens the Order detail page, which shows the same full view the customer sees (deliver-to details, items with photos, totals, payment and timeline) plus the delivery partner. For an order that is Partner assigned or On the way, a Reassign control with a dropdown of currently-online delivery partners lets an admin move the order to a different partner — useful if the originally assigned partner goes offline or is unresponsive.</w:t>
       </w:r>
     </w:p>
     <w:p>
@@ -4429,7 +4836,7 @@
         <w:drawing>
           <wp:inline xmlns:a="http://schemas.openxmlformats.org/drawingml/2006/main" xmlns:pic="http://schemas.openxmlformats.org/drawingml/2006/picture">
             <wp:extent cx="5715000" cy="3571875"/>
-            <wp:docPr id="9020" name="Picture 9020"/>
+            <wp:docPr id="9019" name="Picture 9019" descr="Admin Orders table with order number, customer, store, status, amount, partner and placed time and a status filter"/>
             <wp:cNvGraphicFramePr>
               <a:graphicFrameLocks noChangeAspect="1"/>
             </wp:cNvGraphicFramePr>
@@ -4437,11 +4844,11 @@
               <a:graphicData uri="http://schemas.openxmlformats.org/drawingml/2006/picture">
                 <pic:pic>
                   <pic:nvPicPr>
-                    <pic:cNvPr id="0" name="admin-restaurants.png"/>
+                    <pic:cNvPr id="0" name="v3-admin-orders.png"/>
                     <pic:cNvPicPr/>
                   </pic:nvPicPr>
                   <pic:blipFill>
-                    <a:blip r:embed="rId50"/>
+                    <a:blip r:embed="rId24"/>
                     <a:stretch>
                       <a:fillRect/>
                     </a:stretch>
@@ -4473,32 +4880,7 @@
           <w:sz w:val="20"/>
           <w:szCs w:val="20"/>
         </w:rPr>
-        <w:t xml:space="preserve">Figure 6.3 — Admin dashboard, Restaurants tab, listing every seeded store with a Suspend action.</w:t>
-      </w:r>
-    </w:p>
-    <w:p>
-      <w:pPr>
-        <w:pStyle w:val="Heading2"/>
-        <w:spacing w:before="300" w:after="150"/>
-      </w:pPr>
-      <w:r>
-        <w:rPr>
-          <w:b/>
-          <w:bCs/>
-          <w:color w:val="E8871E"/>
-        </w:rPr>
-        <w:t xml:space="preserve">6.4 Delivery Partners Tab</w:t>
-      </w:r>
-    </w:p>
-    <w:p>
-      <w:pPr>
-        <w:spacing w:after="160"/>
-      </w:pPr>
-      <w:r>
-        <w:rPr>
-          <w:color w:val="1A1A1A"/>
-        </w:rPr>
-        <w:t xml:space="preserve">The Delivery partners tab lists every delivery partner account and its current status (online/offline), giving admin staff visibility into how many partners are actively available at any given moment.</w:t>
+        <w:t xml:space="preserve">Figure 6.2 — Admin Orders: every order with its number, customer, store, status, amount, delivery partner and placed time, plus a status filter.</w:t>
       </w:r>
     </w:p>
     <w:p>
@@ -4510,7 +4892,7 @@
         <w:drawing>
           <wp:inline xmlns:a="http://schemas.openxmlformats.org/drawingml/2006/main" xmlns:pic="http://schemas.openxmlformats.org/drawingml/2006/picture">
             <wp:extent cx="5715000" cy="3571875"/>
-            <wp:docPr id="9021" name="Picture 9021"/>
+            <wp:docPr id="9509" name="Picture 9509" descr="Admin order detail page with deliver-to card, items, totals, timeline, delivery partner and Reassign control"/>
             <wp:cNvGraphicFramePr>
               <a:graphicFrameLocks noChangeAspect="1"/>
             </wp:cNvGraphicFramePr>
@@ -4518,11 +4900,11 @@
               <a:graphicData uri="http://schemas.openxmlformats.org/drawingml/2006/picture">
                 <pic:pic>
                   <pic:nvPicPr>
-                    <pic:cNvPr id="0" name="admin-delivery-partners.png"/>
+                    <pic:cNvPr id="0" name="v3-admin-order-detail.png"/>
                     <pic:cNvPicPr/>
                   </pic:nvPicPr>
                   <pic:blipFill>
-                    <a:blip r:embed="rId51"/>
+                    <a:blip r:embed="rId25"/>
                     <a:stretch>
                       <a:fillRect/>
                     </a:stretch>
@@ -4554,18 +4936,27 @@
           <w:sz w:val="20"/>
           <w:szCs w:val="20"/>
         </w:rPr>
-        <w:t xml:space="preserve">Figure 6.4 — Admin dashboard, Delivery partners tab.</w:t>
-      </w:r>
-    </w:p>
-    <w:p>
-      <w:r>
-        <w:br w:type="page"/>
-      </w:r>
-    </w:p>
-    <w:p>
-      <w:pPr>
-        <w:pStyle w:val="Heading1"/>
-        <w:spacing w:before="400" w:after="200"/>
+        <w:t xml:space="preserve">Figure 6.2a — Admin Order detail (scrolled to the lower part of the page): the deliver-to card, items, totals and payment, the Timeline, the delivery partner and the Reassign control.</w:t>
+      </w:r>
+    </w:p>
+    <w:p>
+      <w:pPr>
+        <w:pStyle w:val="Heading3"/>
+        <w:spacing w:before="200" w:after="100"/>
+      </w:pPr>
+      <w:r>
+        <w:rPr>
+          <w:b/>
+          <w:bCs/>
+          <w:color w:val="3A4A6B"/>
+        </w:rPr>
+        <w:t xml:space="preserve">Step by step: reassigning a stuck delivery</w:t>
+      </w:r>
+    </w:p>
+    <w:p>
+      <w:pPr>
+        <w:spacing w:after="80"/>
+        <w:ind w:left="360"/>
       </w:pPr>
       <w:r>
         <w:rPr>
@@ -4573,7 +4964,53 @@
           <w:bCs/>
           <w:color w:val="1B2A4A"/>
         </w:rPr>
-        <w:t xml:space="preserve">Chapter 7 — Cross-Cutting Features</w:t>
+        <w:t xml:space="preserve">1. </w:t>
+      </w:r>
+      <w:r>
+        <w:rPr>
+          <w:color w:val="1A1A1A"/>
+        </w:rPr>
+        <w:t xml:space="preserve">Open Orders and select the order number (the order must be Partner assigned or On the way).</w:t>
+      </w:r>
+    </w:p>
+    <w:p>
+      <w:pPr>
+        <w:spacing w:after="80"/>
+        <w:ind w:left="360"/>
+      </w:pPr>
+      <w:r>
+        <w:rPr>
+          <w:b/>
+          <w:bCs/>
+          <w:color w:val="1B2A4A"/>
+        </w:rPr>
+        <w:t xml:space="preserve">2. </w:t>
+      </w:r>
+      <w:r>
+        <w:rPr>
+          <w:color w:val="1A1A1A"/>
+        </w:rPr>
+        <w:t xml:space="preserve">On the order detail page, open the Select partner dropdown, which lists every currently-online delivery partner.</w:t>
+      </w:r>
+    </w:p>
+    <w:p>
+      <w:pPr>
+        <w:spacing w:after="80"/>
+        <w:ind w:left="360"/>
+      </w:pPr>
+      <w:r>
+        <w:rPr>
+          <w:b/>
+          <w:bCs/>
+          <w:color w:val="1B2A4A"/>
+        </w:rPr>
+        <w:t xml:space="preserve">3. </w:t>
+      </w:r>
+      <w:r>
+        <w:rPr>
+          <w:color w:val="1A1A1A"/>
+        </w:rPr>
+        <w:t xml:space="preserve">Choose a different partner and select Reassign — the order updates immediately and the new partner sees it under their own Your active deliveries.</w:t>
       </w:r>
     </w:p>
     <w:p>
@@ -4587,7 +5024,7 @@
           <w:bCs/>
           <w:color w:val="E8871E"/>
         </w:rPr>
-        <w:t xml:space="preserve">7.1 Money &amp; Pricing Precision</w:t>
+        <w:t xml:space="preserve">6.3 Vendors</w:t>
       </w:r>
     </w:p>
     <w:p>
@@ -4598,7 +5035,63 @@
         <w:rPr>
           <w:color w:val="1A1A1A"/>
         </w:rPr>
-        <w:t xml:space="preserve">Every part of the platform that touches a price — menu item prices, cart subtotals, delivery fees, order totals — is computed using integer arithmetic in the smallest currency unit (paise, 1/100 of a rupee), never plain floating-point multiplication in JavaScript. This matters because floating-point money math can silently introduce rounding errors (for example, 0.1 + 0.2 not equalling exactly 0.3 in IEEE-754 arithmetic); Postgres's own numeric CHECK constraints on the orders table (including a constraint that a stored total must exactly equal its subtotal plus delivery fee) would reject such an error outright once real, non-round decimal prices are used, rather than the kind of whole-number seed prices that could otherwise mask the bug.</w:t>
+        <w:t xml:space="preserve">The Vendors page lists every store on the platform — 77 in the current seed data, spanning all 11 marketplace categories — with its Active or Suspended status and a Suspend (or Unsuspend) action. Suspending a store immediately removes it from customer browsing without deleting any of its data; unsuspending brings it back. The Add vendor form takes a store name, owner name, email, a temporary password (minimum 6 characters; the admin shares it with the vendor, who can change it from their profile) and latitude/longitude; the new vendor is active immediately and can sign in at /vendor/login.</w:t>
+      </w:r>
+    </w:p>
+    <w:p>
+      <w:pPr>
+        <w:spacing w:before="200" w:after="80"/>
+        <w:jc w:val="center"/>
+      </w:pPr>
+      <w:r>
+        <w:drawing>
+          <wp:inline xmlns:a="http://schemas.openxmlformats.org/drawingml/2006/main" xmlns:pic="http://schemas.openxmlformats.org/drawingml/2006/picture">
+            <wp:extent cx="5715000" cy="3571875"/>
+            <wp:docPr id="9020" name="Picture 9020" descr="Admin Vendors page with the Add vendor form above the vendor list with Suspend actions"/>
+            <wp:cNvGraphicFramePr>
+              <a:graphicFrameLocks noChangeAspect="1"/>
+            </wp:cNvGraphicFramePr>
+            <a:graphic>
+              <a:graphicData uri="http://schemas.openxmlformats.org/drawingml/2006/picture">
+                <pic:pic>
+                  <pic:nvPicPr>
+                    <pic:cNvPr id="0" name="v3-admin-vendors.png"/>
+                    <pic:cNvPicPr/>
+                  </pic:nvPicPr>
+                  <pic:blipFill>
+                    <a:blip r:embed="rId27"/>
+                    <a:stretch>
+                      <a:fillRect/>
+                    </a:stretch>
+                  </pic:blipFill>
+                  <pic:spPr>
+                    <a:xfrm>
+                      <a:off x="0" y="0"/>
+                      <a:ext cx="5715000" cy="3571875"/>
+                    </a:xfrm>
+                    <a:prstGeom prst="rect"/>
+                  </pic:spPr>
+                </pic:pic>
+              </a:graphicData>
+            </a:graphic>
+          </wp:inline>
+        </w:drawing>
+      </w:r>
+    </w:p>
+    <w:p>
+      <w:pPr>
+        <w:spacing w:after="240"/>
+        <w:jc w:val="center"/>
+      </w:pPr>
+      <w:r>
+        <w:rPr>
+          <w:i/>
+          <w:iCs/>
+          <w:color w:val="5A6472"/>
+          <w:sz w:val="20"/>
+          <w:szCs w:val="20"/>
+        </w:rPr>
+        <w:t xml:space="preserve">Figure 6.3 — Admin Vendors: the Add vendor form above the list of every store with its status and a Suspend action.</w:t>
       </w:r>
     </w:p>
     <w:p>
@@ -4612,6 +5105,131 @@
           <w:bCs/>
           <w:color w:val="E8871E"/>
         </w:rPr>
+        <w:t xml:space="preserve">6.4 Delivery Partners</w:t>
+      </w:r>
+    </w:p>
+    <w:p>
+      <w:pPr>
+        <w:spacing w:after="160"/>
+      </w:pPr>
+      <w:r>
+        <w:rPr>
+          <w:color w:val="1A1A1A"/>
+        </w:rPr>
+        <w:t xml:space="preserve">The Delivery Partners page lists every delivery partner account with its current status (Online or Offline) and vehicle, giving admin staff visibility into how many partners are actively available at any given moment. The Add delivery partner form takes a full name, email, temporary password (minimum 6 characters, shared by the admin with the partner) and vehicle; the new partner can sign in at /delivery/login.</w:t>
+      </w:r>
+    </w:p>
+    <w:p>
+      <w:pPr>
+        <w:spacing w:before="200" w:after="80"/>
+        <w:jc w:val="center"/>
+      </w:pPr>
+      <w:r>
+        <w:drawing>
+          <wp:inline xmlns:a="http://schemas.openxmlformats.org/drawingml/2006/main" xmlns:pic="http://schemas.openxmlformats.org/drawingml/2006/picture">
+            <wp:extent cx="5715000" cy="3571875"/>
+            <wp:docPr id="9021" name="Picture 9021" descr="Admin Delivery Partners page with the Add delivery partner form and the partner list"/>
+            <wp:cNvGraphicFramePr>
+              <a:graphicFrameLocks noChangeAspect="1"/>
+            </wp:cNvGraphicFramePr>
+            <a:graphic>
+              <a:graphicData uri="http://schemas.openxmlformats.org/drawingml/2006/picture">
+                <pic:pic>
+                  <pic:nvPicPr>
+                    <pic:cNvPr id="0" name="v3-admin-partners.png"/>
+                    <pic:cNvPicPr/>
+                  </pic:nvPicPr>
+                  <pic:blipFill>
+                    <a:blip r:embed="rId28"/>
+                    <a:stretch>
+                      <a:fillRect/>
+                    </a:stretch>
+                  </pic:blipFill>
+                  <pic:spPr>
+                    <a:xfrm>
+                      <a:off x="0" y="0"/>
+                      <a:ext cx="5715000" cy="3571875"/>
+                    </a:xfrm>
+                    <a:prstGeom prst="rect"/>
+                  </pic:spPr>
+                </pic:pic>
+              </a:graphicData>
+            </a:graphic>
+          </wp:inline>
+        </w:drawing>
+      </w:r>
+    </w:p>
+    <w:p>
+      <w:pPr>
+        <w:spacing w:after="240"/>
+        <w:jc w:val="center"/>
+      </w:pPr>
+      <w:r>
+        <w:rPr>
+          <w:i/>
+          <w:iCs/>
+          <w:color w:val="5A6472"/>
+          <w:sz w:val="20"/>
+          <w:szCs w:val="20"/>
+        </w:rPr>
+        <w:t xml:space="preserve">Figure 6.4 — Admin Delivery Partners: the Add delivery partner form above the list of partners with their status and vehicle.</w:t>
+      </w:r>
+    </w:p>
+    <w:p>
+      <w:r>
+        <w:br w:type="page"/>
+      </w:r>
+    </w:p>
+    <w:p>
+      <w:pPr>
+        <w:pStyle w:val="Heading1"/>
+        <w:spacing w:before="400" w:after="200"/>
+      </w:pPr>
+      <w:r>
+        <w:rPr>
+          <w:b/>
+          <w:bCs/>
+          <w:color w:val="1B2A4A"/>
+        </w:rPr>
+        <w:t xml:space="preserve">Chapter 7 — Cross-Cutting Features</w:t>
+      </w:r>
+    </w:p>
+    <w:p>
+      <w:pPr>
+        <w:pStyle w:val="Heading2"/>
+        <w:spacing w:before="300" w:after="150"/>
+      </w:pPr>
+      <w:r>
+        <w:rPr>
+          <w:b/>
+          <w:bCs/>
+          <w:color w:val="E8871E"/>
+        </w:rPr>
+        <w:t xml:space="preserve">7.1 Money &amp; Pricing Precision</w:t>
+      </w:r>
+    </w:p>
+    <w:p>
+      <w:pPr>
+        <w:spacing w:after="160"/>
+      </w:pPr>
+      <w:r>
+        <w:rPr>
+          <w:color w:val="1A1A1A"/>
+        </w:rPr>
+        <w:t xml:space="preserve">Every part of the platform that touches a price — menu item prices, cart subtotals, delivery fees, order totals — is computed using integer arithmetic in the smallest currency unit (paise, 1/100 of a rupee), never plain floating-point multiplication in JavaScript. This matters because floating-point money math can silently introduce rounding errors (for example, 0.1 + 0.2 not equalling exactly 0.3 in IEEE-754 arithmetic); Postgres's own numeric CHECK constraints on the orders table (including a constraint that a stored total must exactly equal its subtotal plus delivery fee) would reject such an error outright once real, non-round decimal prices are used, rather than the kind of whole-number seed prices that could otherwise mask the bug.</w:t>
+      </w:r>
+    </w:p>
+    <w:p>
+      <w:pPr>
+        <w:pStyle w:val="Heading2"/>
+        <w:spacing w:before="300" w:after="150"/>
+      </w:pPr>
+      <w:r>
+        <w:rPr>
+          <w:b/>
+          <w:bCs/>
+          <w:color w:val="E8871E"/>
+        </w:rPr>
         <w:t xml:space="preserve">7.2 Notifications &amp; the n8n Automation Layer</w:t>
       </w:r>
     </w:p>
@@ -4623,7 +5241,7 @@
         <w:rPr>
           <w:color w:val="1A1A1A"/>
         </w:rPr>
-        <w:t xml:space="preserve">A set of n8n workflows automate cross-portal side effects that would otherwise require polling: resolving a mock payment shortly after an order is placed, notifying a vendor of a new order, and similar events. n8n calls back into the Next.js application through a small family of "/api/internal/*" routes, authenticated with a shared secret header (X-Internal-Secret) rather than a normal user session, since these calls originate from an automation server rather than a logged-in browser. If no n8n instance is reachable, every one of these flows still completes correctly through an in-process fallback inside the relevant API route — n8n makes the demo faster, not functionally required.</w:t>
+        <w:t xml:space="preserve">A set of n8n workflows automate cross-portal side effects that would otherwise require polling: resolving a mock payment shortly after an order is placed, notifying a vendor of a new order, emailing the customer when an order is accepted and when it is delivered, and similar events. n8n calls back into the Next.js application through a small family of "/api/internal/*" routes, authenticated with a shared secret header (X-Internal-Secret) rather than a normal user session, since these calls originate from an automation server rather than a logged-in browser. If no n8n instance is reachable, every one of these flows still completes correctly through an in-process fallback inside the relevant API route — n8n makes the demo faster, not functionally required.</w:t>
       </w:r>
     </w:p>
     <w:p>
@@ -4754,7 +5372,7 @@
         <w:rPr>
           <w:color w:val="1A1A1A"/>
         </w:rPr>
-        <w:t xml:space="preserve">Writes a placeholder notification row on every filtered transition; on accepted specifically, a second branch also emails the customer via a Gmail node (requires a connected Gmail OAuth2 credential — without one this branch fails at the Gmail node only, which does not block the order).</w:t>
+        <w:t xml:space="preserve">Writes a placeholder notification row on every filtered transition; on accepted specifically, a second branch also emails the customer via a Gmail node. The email goes to the address entered at checkout (requires a connected Gmail OAuth2 credential — without one this branch fails at the Gmail node only, which does not block the order).</w:t>
       </w:r>
     </w:p>
     <w:p>
@@ -4828,7 +5446,7 @@
         <w:rPr>
           <w:color w:val="1A1A1A"/>
         </w:rPr>
-        <w:t xml:space="preserve">Propagates delivery-side status changes to any downstream notification/logging the workflow defines.</w:t>
+        <w:t xml:space="preserve">Propagates delivery-side status changes to any downstream notification/logging the workflow defines. On delivered it also sends the delivered email via a Gmail node to the address entered at checkout: the subject is "Your order from &lt;store&gt; has been delivered", and the body thanks the customer, lists the items (with photos, quantities and options), the subtotal, delivery fee and total, and the name, phone and address it was delivered to.</w:t>
       </w:r>
     </w:p>
     <w:p>
@@ -4842,7 +5460,7 @@
           <w:bCs/>
           <w:color w:val="3A4A6B"/>
         </w:rPr>
-        <w:t xml:space="preserve">7.2.2 Live Verification — 2026-09-28</w:t>
+        <w:t xml:space="preserve">7.2.2 Live Verification — 2026-09-28 and 2026-09-30</w:t>
       </w:r>
     </w:p>
     <w:p>
@@ -4901,7 +5519,7 @@
         <w:rPr>
           <w:color w:val="1A1A1A"/>
         </w:rPr>
-        <w:t xml:space="preserve">Workflow 03 (Restaurant Accepts): the seeded vendor account (daily-basket@foodhub.local) advanced the same order through accepted → preparing → ready via /vendor/orders in this session, which is the real trigger for workflow 03's filtered UPDATE OF status. The Gmail-send branch was not separately confirmed (no Gmail credential is configured in this local n8n instance, matching the known gap in section 4 of docs/n8n-webhook-setup.md), so this document does not claim that branch fired — only that the accepted/preparing/ready transitions themselves, which are what the workflow listens for, occurred live.</w:t>
+        <w:t xml:space="preserve">Workflow 03 (Restaurant Accepts): the seeded vendor account (daily-basket@foodhub.local) advanced the same order through accepted → preparing → ready via /vendor/orders in this session, which is the real trigger for workflow 03's filtered UPDATE OF status. The Gmail-send branch was not separately confirmed (no Gmail credential is configured in this local n8n instance, matching the known gap in section 4 of docs/n8n-webhook-setup.md), so this document did not claim that branch fired at the time (confirmed later, see 2026-09-30 below) — only that the accepted/preparing/ready transitions themselves, which are what the workflow listens for, occurred live.</w:t>
       </w:r>
     </w:p>
     <w:p>
@@ -4917,7 +5535,7 @@
         <w:rPr>
           <w:color w:val="1A1A1A"/>
         </w:rPr>
-        <w:t xml:space="preserve">Workflow 04 (Delivery Partner Assignment): NOT observed to auto-assign in this test. With the order at status=ready and a delivery partner already online (delivery@foodhub.local), the order appeared under that partner's “Available orders” list for manual self-claim rather than being auto-assigned by the workflow — orders.delivery_partner_id remained null until the partner claimed it by hand through /delivery/dashboard. This manual is deliberately not claiming workflow 04 fired successfully; it may not be active in this local n8n instance, or its assignment call may not have succeeded silently. Either way, the self-claim path (section 5.2) worked correctly as the primary, always-available assignment mechanism, exactly as designed — workflow 04 is additive automation on top of it, not a replacement for it.</w:t>
+        <w:t xml:space="preserve">Workflow 04 (Delivery Partner Assignment): NOT observed to auto-assign in this test. With the order at status=ready and a delivery partner already online (delivery@foodhub.local), the order appeared under that partner's “Available orders” list for manual self-accept rather than being auto-assigned by the workflow — orders.delivery_partner_id remained null until the partner accepted it by hand through /delivery/dashboard. This manual is deliberately not claiming workflow 04 fired successfully; it may not be active in this local n8n instance, or its assignment call may not have succeeded silently. Either way, the manual accept path (section 5.1) worked correctly as the primary, always-available assignment mechanism, exactly as designed — workflow 04 is additive automation on top of it, not a replacement for it.</w:t>
       </w:r>
     </w:p>
     <w:p>
@@ -4933,7 +5551,7 @@
         <w:rPr>
           <w:color w:val="1A1A1A"/>
         </w:rPr>
-        <w:t xml:space="preserve">Workflow 05 (Delivery Status Propagation): not separately exercised in this pass (the test order was left at the claimed/assigned stage); see docs/n8n-webhook-setup.md section 5 for its documented test procedure.</w:t>
+        <w:t xml:space="preserve">Workflow 05 (Delivery Status Propagation): not separately exercised in this pass (the test order was left at the accepted/assigned stage); see docs/n8n-webhook-setup.md section 5 for its documented test procedure; the delivered email it sends was verified live on 2026-09-30, see below.</w:t>
       </w:r>
     </w:p>
     <w:p>
@@ -4944,7 +5562,18 @@
         <w:rPr>
           <w:color w:val="1A1A1A"/>
         </w:rPr>
-        <w:t xml:space="preserve">Net conclusion: this local instance's checkout-critical automation (workflows 01 and 02) is live, active, and measurably faster than its own documented fallback — not merely configured on paper. Workflow 04's auto-assignment did not visibly act in this run, so treat delivery self-claim as the mechanism to rely on and workflow 04 as an unconfirmed bonus in this environment rather than a guaranteed path.</w:t>
+        <w:t xml:space="preserve">Net conclusion: this local instance's checkout-critical automation (workflows 01 and 02) is live, active, and measurably faster than its own documented fallback — not merely configured on paper. Workflow 04's auto-assignment did not visibly act in this run, so treat the delivery partner's manual Accept as the mechanism to rely on and workflow 04 as an unconfirmed bonus in this environment rather than a guaranteed path.</w:t>
+      </w:r>
+    </w:p>
+    <w:p>
+      <w:pPr>
+        <w:spacing w:after="160"/>
+      </w:pPr>
+      <w:r>
+        <w:rPr>
+          <w:color w:val="1A1A1A"/>
+        </w:rPr>
+        <w:t xml:space="preserve">2026-09-30 follow-up: the order-accepted email (workflow 03) and the delivered email (workflow 05) were verified live against the same local stack. An order was placed with a checkout email address, accepted by the vendor, then moved through picked up to delivered by a delivery partner. Both emails arrived at the checkout email address (not the account address), and the delivered email carried the subject "Your order from &lt;store&gt; has been delivered", the thank-you sentence, the item rows with photos, quantities and options, the subtotal, delivery fee and total, and the delivered-to name, phone and address. The Gmail branch noted as unconfirmed above is therefore now confirmed for both emails.</w:t>
       </w:r>
     </w:p>
     <w:p>
@@ -5625,7 +6254,7 @@
                     </pic:cNvPicPr>
                   </pic:nvPicPr>
                   <pic:blipFill>
-                    <a:blip r:embed="rId31" cstate="none"/>
+                    <a:blip r:embed="rId29" cstate="none"/>
                     <a:srcRect/>
                     <a:stretch>
                       <a:fillRect/>
@@ -5815,7 +6444,7 @@
         <w:rPr>
           <w:color w:val="1A1A1A"/>
         </w:rPr>
-        <w:t xml:space="preserve">The central transactional record: customer, restaurant/store, an optional assigned delivery partner, a delivery address, and a status that moves forward through a fixed chain — placed, accepted, preparing, ready, assigned, picked_up, delivered, or cancelled at any point. Subtotal, delivery fee, and total are each checked non-negative, and a database constraint requires total to exactly equal subtotal plus delivery fee, closing off an entire class of pricing bug at the data layer.</w:t>
+        <w:t xml:space="preserve">The central transactional record: customer, restaurant/store, an optional assigned delivery partner, a delivery address, a recipient phone number, and a status that moves forward through a fixed chain — placed, accepted, preparing, ready, assigned, picked_up, delivered, or rejected/cancelled at any point. Subtotal, delivery fee, and total are each checked non-negative, and a database constraint requires total to exactly equal subtotal plus delivery fee, closing off an entire class of pricing bug at the data layer. Version 3.0 added recipient_phone (text, required; older orders hold the literal "Not provided") and three nullable timestamps, accepted_at, picked_up_at and delivered_at, that a database trigger stamps when the status changes.</w:t>
       </w:r>
     </w:p>
     <w:p>
@@ -6376,7 +7005,7 @@
                 <w:sz w:val="20"/>
                 <w:szCs w:val="20"/>
               </w:rPr>
-              <w:t xml:space="preserve">status, subtotal, delivery_fee, total</w:t>
+              <w:t xml:space="preserve">status, subtotal, delivery_fee, total, recipient_phone, accepted_at, picked_up_at, delivered_at</w:t>
             </w:r>
           </w:p>
         </w:tc>
@@ -7208,6 +7837,17 @@
     </w:tbl>
     <w:p>
       <w:pPr>
+        <w:spacing w:after="160"/>
+      </w:pPr>
+      <w:r>
+        <w:rPr>
+          <w:color w:val="1A1A1A"/>
+        </w:rPr>
+        <w:t xml:space="preserve">A second delivery partner is not part of the seed data: create one at /delivery/login ("New partner? Sign up") or have an admin add one from Admin → Delivery Partners. With more than one partner Online, workflow 04 auto-assigns a ready order to one of them; with none Online it appears under Available orders for any Online partner to accept. Vendor, delivery-partner and admin accounts that an admin creates from the Admin portal are likewise not part of the seed data.</w:t>
+      </w:r>
+    </w:p>
+    <w:p>
+      <w:pPr>
         <w:pStyle w:val="Heading2"/>
         <w:spacing w:before="300" w:after="150"/>
       </w:pPr>
@@ -14352,7 +14992,7 @@
                 <w:sz w:val="20"/>
                 <w:szCs w:val="20"/>
               </w:rPr>
-              <w:t xml:space="preserve">An order that has reached Ready status and has no delivery partner assigned yet, visible to online delivery partners to claim.</w:t>
+              <w:t xml:space="preserve">An order that has reached Ready status and has no delivery partner assigned yet, visible to online delivery partners to accept.</w:t>
             </w:r>
           </w:p>
         </w:tc>

</xml_diff>